<commit_message>
Actualiza tutorial del capítulo 2: agrega conclusión
</commit_message>
<xml_diff>
--- a/02-Fundamentos-de-Git.docx
+++ b/02-Fundamentos-de-Git.docx
@@ -93,8 +93,6 @@
           <w:rFonts w:ascii="Times New Roman" w:eastAsia="Times New Roman" w:hAnsi="Times New Roman" w:cs="Times New Roman"/>
           <w:b/>
           <w:bCs/>
-          <w:sz w:val="27"/>
-          <w:szCs w:val="27"/>
           <w:lang w:val="es-ES"/>
         </w:rPr>
       </w:pPr>
@@ -103,8 +101,6 @@
           <w:rFonts w:ascii="Times New Roman" w:eastAsia="Times New Roman" w:hAnsi="Times New Roman" w:cs="Times New Roman"/>
           <w:b/>
           <w:bCs/>
-          <w:sz w:val="27"/>
-          <w:szCs w:val="27"/>
           <w:lang w:val="es-ES"/>
         </w:rPr>
         <w:t xml:space="preserve">Capítulo 2: Fundamentos de </w:t>
@@ -115,8 +111,6 @@
           <w:rFonts w:ascii="Times New Roman" w:eastAsia="Times New Roman" w:hAnsi="Times New Roman" w:cs="Times New Roman"/>
           <w:b/>
           <w:bCs/>
-          <w:sz w:val="27"/>
-          <w:szCs w:val="27"/>
           <w:lang w:val="es-ES"/>
         </w:rPr>
         <w:t>Git</w:t>
@@ -128,8 +122,6 @@
         <w:spacing w:before="100" w:beforeAutospacing="1" w:after="100" w:afterAutospacing="1" w:line="240" w:lineRule="auto"/>
         <w:rPr>
           <w:rFonts w:ascii="Times New Roman" w:eastAsia="Times New Roman" w:hAnsi="Times New Roman" w:cs="Times New Roman"/>
-          <w:sz w:val="24"/>
-          <w:szCs w:val="24"/>
           <w:lang w:val="es-ES"/>
         </w:rPr>
       </w:pPr>
@@ -138,8 +130,6 @@
           <w:rFonts w:ascii="Times New Roman" w:eastAsia="Times New Roman" w:hAnsi="Times New Roman" w:cs="Times New Roman"/>
           <w:b/>
           <w:bCs/>
-          <w:sz w:val="24"/>
-          <w:szCs w:val="24"/>
           <w:lang w:val="es-ES"/>
         </w:rPr>
         <w:t>Objetivo:</w:t>
@@ -147,8 +137,6 @@
       <w:r>
         <w:rPr>
           <w:rFonts w:ascii="Times New Roman" w:eastAsia="Times New Roman" w:hAnsi="Times New Roman" w:cs="Times New Roman"/>
-          <w:sz w:val="24"/>
-          <w:szCs w:val="24"/>
           <w:lang w:val="es-ES"/>
         </w:rPr>
         <w:t xml:space="preserve"> aprender el ciclo básico de trabajo con </w:t>
@@ -157,8 +145,6 @@
       <w:r>
         <w:rPr>
           <w:rFonts w:ascii="Times New Roman" w:eastAsia="Times New Roman" w:hAnsi="Times New Roman" w:cs="Times New Roman"/>
-          <w:sz w:val="24"/>
-          <w:szCs w:val="24"/>
           <w:lang w:val="es-ES"/>
         </w:rPr>
         <w:t>Git</w:t>
@@ -167,8 +153,6 @@
       <w:r>
         <w:rPr>
           <w:rFonts w:ascii="Times New Roman" w:eastAsia="Times New Roman" w:hAnsi="Times New Roman" w:cs="Times New Roman"/>
-          <w:sz w:val="24"/>
-          <w:szCs w:val="24"/>
           <w:lang w:val="es-ES"/>
         </w:rPr>
         <w:t>: obtener un repositorio, registrar cambios, consultar el historial, deshacer errores y trabajar con remotos.</w:t>
@@ -179,8 +163,6 @@
         <w:spacing w:before="100" w:beforeAutospacing="1" w:after="100" w:afterAutospacing="1" w:line="240" w:lineRule="auto"/>
         <w:rPr>
           <w:rFonts w:ascii="Times New Roman" w:eastAsia="Times New Roman" w:hAnsi="Times New Roman" w:cs="Times New Roman"/>
-          <w:sz w:val="24"/>
-          <w:szCs w:val="24"/>
         </w:rPr>
       </w:pPr>
       <w:proofErr w:type="spellStart"/>
@@ -189,8 +171,6 @@
           <w:rFonts w:ascii="Times New Roman" w:eastAsia="Times New Roman" w:hAnsi="Times New Roman" w:cs="Times New Roman"/>
           <w:b/>
           <w:bCs/>
-          <w:sz w:val="24"/>
-          <w:szCs w:val="24"/>
         </w:rPr>
         <w:t>Conceptos</w:t>
       </w:r>
@@ -200,8 +180,6 @@
           <w:rFonts w:ascii="Times New Roman" w:eastAsia="Times New Roman" w:hAnsi="Times New Roman" w:cs="Times New Roman"/>
           <w:b/>
           <w:bCs/>
-          <w:sz w:val="24"/>
-          <w:szCs w:val="24"/>
         </w:rPr>
         <w:t xml:space="preserve"> clave</w:t>
       </w:r>
@@ -215,8 +193,6 @@
         <w:spacing w:before="100" w:beforeAutospacing="1" w:after="100" w:afterAutospacing="1" w:line="240" w:lineRule="auto"/>
         <w:rPr>
           <w:rFonts w:ascii="Times New Roman" w:eastAsia="Times New Roman" w:hAnsi="Times New Roman" w:cs="Times New Roman"/>
-          <w:sz w:val="24"/>
-          <w:szCs w:val="24"/>
           <w:lang w:val="es-ES"/>
         </w:rPr>
       </w:pPr>
@@ -225,8 +201,6 @@
           <w:rFonts w:ascii="Times New Roman" w:eastAsia="Times New Roman" w:hAnsi="Times New Roman" w:cs="Times New Roman"/>
           <w:b/>
           <w:bCs/>
-          <w:sz w:val="24"/>
-          <w:szCs w:val="24"/>
           <w:lang w:val="es-ES"/>
         </w:rPr>
         <w:t>Obtener un repositorio:</w:t>
@@ -234,8 +208,6 @@
       <w:r>
         <w:rPr>
           <w:rFonts w:ascii="Times New Roman" w:eastAsia="Times New Roman" w:hAnsi="Times New Roman" w:cs="Times New Roman"/>
-          <w:sz w:val="24"/>
-          <w:szCs w:val="24"/>
           <w:lang w:val="es-ES"/>
         </w:rPr>
         <w:t xml:space="preserve"> se puede iniciar uno nuevo (</w:t>
@@ -243,9 +215,7 @@
       <w:proofErr w:type="spellStart"/>
       <w:r>
         <w:rPr>
-          <w:rFonts w:ascii="Courier New" w:eastAsia="Times New Roman" w:hAnsi="Courier New" w:cs="Courier New"/>
-          <w:sz w:val="20"/>
-          <w:szCs w:val="20"/>
+          <w:rFonts w:ascii="Times New Roman" w:eastAsia="Times New Roman" w:hAnsi="Times New Roman" w:cs="Times New Roman"/>
           <w:lang w:val="es-ES"/>
         </w:rPr>
         <w:t>git</w:t>
@@ -253,9 +223,7 @@
       <w:proofErr w:type="spellEnd"/>
       <w:r>
         <w:rPr>
-          <w:rFonts w:ascii="Courier New" w:eastAsia="Times New Roman" w:hAnsi="Courier New" w:cs="Courier New"/>
-          <w:sz w:val="20"/>
-          <w:szCs w:val="20"/>
+          <w:rFonts w:ascii="Times New Roman" w:eastAsia="Times New Roman" w:hAnsi="Times New Roman" w:cs="Times New Roman"/>
           <w:lang w:val="es-ES"/>
         </w:rPr>
         <w:t xml:space="preserve"> </w:t>
@@ -263,9 +231,7 @@
       <w:proofErr w:type="spellStart"/>
       <w:r>
         <w:rPr>
-          <w:rFonts w:ascii="Courier New" w:eastAsia="Times New Roman" w:hAnsi="Courier New" w:cs="Courier New"/>
-          <w:sz w:val="20"/>
-          <w:szCs w:val="20"/>
+          <w:rFonts w:ascii="Times New Roman" w:eastAsia="Times New Roman" w:hAnsi="Times New Roman" w:cs="Times New Roman"/>
           <w:lang w:val="es-ES"/>
         </w:rPr>
         <w:t>init</w:t>
@@ -274,8 +240,6 @@
       <w:r>
         <w:rPr>
           <w:rFonts w:ascii="Times New Roman" w:eastAsia="Times New Roman" w:hAnsi="Times New Roman" w:cs="Times New Roman"/>
-          <w:sz w:val="24"/>
-          <w:szCs w:val="24"/>
           <w:lang w:val="es-ES"/>
         </w:rPr>
         <w:t>) o clonar uno existente (</w:t>
@@ -283,9 +247,7 @@
       <w:proofErr w:type="spellStart"/>
       <w:r>
         <w:rPr>
-          <w:rFonts w:ascii="Courier New" w:eastAsia="Times New Roman" w:hAnsi="Courier New" w:cs="Courier New"/>
-          <w:sz w:val="20"/>
-          <w:szCs w:val="20"/>
+          <w:rFonts w:ascii="Times New Roman" w:eastAsia="Times New Roman" w:hAnsi="Times New Roman" w:cs="Times New Roman"/>
           <w:lang w:val="es-ES"/>
         </w:rPr>
         <w:t>git</w:t>
@@ -293,9 +255,7 @@
       <w:proofErr w:type="spellEnd"/>
       <w:r>
         <w:rPr>
-          <w:rFonts w:ascii="Courier New" w:eastAsia="Times New Roman" w:hAnsi="Courier New" w:cs="Courier New"/>
-          <w:sz w:val="20"/>
-          <w:szCs w:val="20"/>
+          <w:rFonts w:ascii="Times New Roman" w:eastAsia="Times New Roman" w:hAnsi="Times New Roman" w:cs="Times New Roman"/>
           <w:lang w:val="es-ES"/>
         </w:rPr>
         <w:t xml:space="preserve"> clone</w:t>
@@ -303,8 +263,6 @@
       <w:r>
         <w:rPr>
           <w:rFonts w:ascii="Times New Roman" w:eastAsia="Times New Roman" w:hAnsi="Times New Roman" w:cs="Times New Roman"/>
-          <w:sz w:val="24"/>
-          <w:szCs w:val="24"/>
           <w:lang w:val="es-ES"/>
         </w:rPr>
         <w:t>).</w:t>
@@ -319,8 +277,6 @@
         <w:spacing w:before="100" w:beforeAutospacing="1" w:after="100" w:afterAutospacing="1" w:line="240" w:lineRule="auto"/>
         <w:rPr>
           <w:rFonts w:ascii="Times New Roman" w:eastAsia="Times New Roman" w:hAnsi="Times New Roman" w:cs="Times New Roman"/>
-          <w:sz w:val="24"/>
-          <w:szCs w:val="24"/>
           <w:lang w:val="es-ES"/>
         </w:rPr>
       </w:pPr>
@@ -329,8 +285,6 @@
           <w:rFonts w:ascii="Times New Roman" w:eastAsia="Times New Roman" w:hAnsi="Times New Roman" w:cs="Times New Roman"/>
           <w:b/>
           <w:bCs/>
-          <w:sz w:val="24"/>
-          <w:szCs w:val="24"/>
           <w:lang w:val="es-ES"/>
         </w:rPr>
         <w:t>Ciclo de vida de un archivo:</w:t>
@@ -338,8 +292,6 @@
       <w:r>
         <w:rPr>
           <w:rFonts w:ascii="Times New Roman" w:eastAsia="Times New Roman" w:hAnsi="Times New Roman" w:cs="Times New Roman"/>
-          <w:sz w:val="24"/>
-          <w:szCs w:val="24"/>
           <w:lang w:val="es-ES"/>
         </w:rPr>
         <w:t xml:space="preserve"> </w:t>
@@ -349,8 +301,6 @@
           <w:rFonts w:ascii="Times New Roman" w:eastAsia="Times New Roman" w:hAnsi="Times New Roman" w:cs="Times New Roman"/>
           <w:i/>
           <w:iCs/>
-          <w:sz w:val="24"/>
-          <w:szCs w:val="24"/>
           <w:lang w:val="es-ES"/>
         </w:rPr>
         <w:t>sin seguimiento</w:t>
@@ -358,8 +308,6 @@
       <w:r>
         <w:rPr>
           <w:rFonts w:ascii="Times New Roman" w:eastAsia="Times New Roman" w:hAnsi="Times New Roman" w:cs="Times New Roman"/>
-          <w:sz w:val="24"/>
-          <w:szCs w:val="24"/>
           <w:lang w:val="es-ES"/>
         </w:rPr>
         <w:t xml:space="preserve"> (</w:t>
@@ -368,8 +316,6 @@
       <w:r>
         <w:rPr>
           <w:rFonts w:ascii="Times New Roman" w:eastAsia="Times New Roman" w:hAnsi="Times New Roman" w:cs="Times New Roman"/>
-          <w:sz w:val="24"/>
-          <w:szCs w:val="24"/>
           <w:lang w:val="es-ES"/>
         </w:rPr>
         <w:t>untracked</w:t>
@@ -378,8 +324,6 @@
       <w:r>
         <w:rPr>
           <w:rFonts w:ascii="Times New Roman" w:eastAsia="Times New Roman" w:hAnsi="Times New Roman" w:cs="Times New Roman"/>
-          <w:sz w:val="24"/>
-          <w:szCs w:val="24"/>
           <w:lang w:val="es-ES"/>
         </w:rPr>
         <w:t xml:space="preserve">) → </w:t>
@@ -389,8 +333,6 @@
           <w:rFonts w:ascii="Times New Roman" w:eastAsia="Times New Roman" w:hAnsi="Times New Roman" w:cs="Times New Roman"/>
           <w:i/>
           <w:iCs/>
-          <w:sz w:val="24"/>
-          <w:szCs w:val="24"/>
           <w:lang w:val="es-ES"/>
         </w:rPr>
         <w:t>preparado</w:t>
@@ -398,8 +340,6 @@
       <w:r>
         <w:rPr>
           <w:rFonts w:ascii="Times New Roman" w:eastAsia="Times New Roman" w:hAnsi="Times New Roman" w:cs="Times New Roman"/>
-          <w:sz w:val="24"/>
-          <w:szCs w:val="24"/>
           <w:lang w:val="es-ES"/>
         </w:rPr>
         <w:t xml:space="preserve"> (</w:t>
@@ -408,8 +348,6 @@
       <w:r>
         <w:rPr>
           <w:rFonts w:ascii="Times New Roman" w:eastAsia="Times New Roman" w:hAnsi="Times New Roman" w:cs="Times New Roman"/>
-          <w:sz w:val="24"/>
-          <w:szCs w:val="24"/>
           <w:lang w:val="es-ES"/>
         </w:rPr>
         <w:t>staged</w:t>
@@ -418,8 +356,6 @@
       <w:r>
         <w:rPr>
           <w:rFonts w:ascii="Times New Roman" w:eastAsia="Times New Roman" w:hAnsi="Times New Roman" w:cs="Times New Roman"/>
-          <w:sz w:val="24"/>
-          <w:szCs w:val="24"/>
           <w:lang w:val="es-ES"/>
         </w:rPr>
         <w:t xml:space="preserve">, tras </w:t>
@@ -427,9 +363,7 @@
       <w:proofErr w:type="spellStart"/>
       <w:r>
         <w:rPr>
-          <w:rFonts w:ascii="Courier New" w:eastAsia="Times New Roman" w:hAnsi="Courier New" w:cs="Courier New"/>
-          <w:sz w:val="20"/>
-          <w:szCs w:val="20"/>
+          <w:rFonts w:ascii="Times New Roman" w:eastAsia="Times New Roman" w:hAnsi="Times New Roman" w:cs="Times New Roman"/>
           <w:lang w:val="es-ES"/>
         </w:rPr>
         <w:t>git</w:t>
@@ -437,9 +371,7 @@
       <w:proofErr w:type="spellEnd"/>
       <w:r>
         <w:rPr>
-          <w:rFonts w:ascii="Courier New" w:eastAsia="Times New Roman" w:hAnsi="Courier New" w:cs="Courier New"/>
-          <w:sz w:val="20"/>
-          <w:szCs w:val="20"/>
+          <w:rFonts w:ascii="Times New Roman" w:eastAsia="Times New Roman" w:hAnsi="Times New Roman" w:cs="Times New Roman"/>
           <w:lang w:val="es-ES"/>
         </w:rPr>
         <w:t xml:space="preserve"> </w:t>
@@ -447,9 +379,7 @@
       <w:proofErr w:type="spellStart"/>
       <w:r>
         <w:rPr>
-          <w:rFonts w:ascii="Courier New" w:eastAsia="Times New Roman" w:hAnsi="Courier New" w:cs="Courier New"/>
-          <w:sz w:val="20"/>
-          <w:szCs w:val="20"/>
+          <w:rFonts w:ascii="Times New Roman" w:eastAsia="Times New Roman" w:hAnsi="Times New Roman" w:cs="Times New Roman"/>
           <w:lang w:val="es-ES"/>
         </w:rPr>
         <w:t>add</w:t>
@@ -458,8 +388,6 @@
       <w:r>
         <w:rPr>
           <w:rFonts w:ascii="Times New Roman" w:eastAsia="Times New Roman" w:hAnsi="Times New Roman" w:cs="Times New Roman"/>
-          <w:sz w:val="24"/>
-          <w:szCs w:val="24"/>
           <w:lang w:val="es-ES"/>
         </w:rPr>
         <w:t xml:space="preserve">) → </w:t>
@@ -469,8 +397,6 @@
           <w:rFonts w:ascii="Times New Roman" w:eastAsia="Times New Roman" w:hAnsi="Times New Roman" w:cs="Times New Roman"/>
           <w:i/>
           <w:iCs/>
-          <w:sz w:val="24"/>
-          <w:szCs w:val="24"/>
           <w:lang w:val="es-ES"/>
         </w:rPr>
         <w:t>confirmado</w:t>
@@ -478,8 +404,6 @@
       <w:r>
         <w:rPr>
           <w:rFonts w:ascii="Times New Roman" w:eastAsia="Times New Roman" w:hAnsi="Times New Roman" w:cs="Times New Roman"/>
-          <w:sz w:val="24"/>
-          <w:szCs w:val="24"/>
           <w:lang w:val="es-ES"/>
         </w:rPr>
         <w:t xml:space="preserve"> (</w:t>
@@ -488,8 +412,6 @@
       <w:r>
         <w:rPr>
           <w:rFonts w:ascii="Times New Roman" w:eastAsia="Times New Roman" w:hAnsi="Times New Roman" w:cs="Times New Roman"/>
-          <w:sz w:val="24"/>
-          <w:szCs w:val="24"/>
           <w:lang w:val="es-ES"/>
         </w:rPr>
         <w:t>committed</w:t>
@@ -498,8 +420,6 @@
       <w:r>
         <w:rPr>
           <w:rFonts w:ascii="Times New Roman" w:eastAsia="Times New Roman" w:hAnsi="Times New Roman" w:cs="Times New Roman"/>
-          <w:sz w:val="24"/>
-          <w:szCs w:val="24"/>
           <w:lang w:val="es-ES"/>
         </w:rPr>
         <w:t xml:space="preserve">) → </w:t>
@@ -509,8 +429,6 @@
           <w:rFonts w:ascii="Times New Roman" w:eastAsia="Times New Roman" w:hAnsi="Times New Roman" w:cs="Times New Roman"/>
           <w:i/>
           <w:iCs/>
-          <w:sz w:val="24"/>
-          <w:szCs w:val="24"/>
           <w:lang w:val="es-ES"/>
         </w:rPr>
         <w:t>modificado</w:t>
@@ -518,8 +436,6 @@
       <w:r>
         <w:rPr>
           <w:rFonts w:ascii="Times New Roman" w:eastAsia="Times New Roman" w:hAnsi="Times New Roman" w:cs="Times New Roman"/>
-          <w:sz w:val="24"/>
-          <w:szCs w:val="24"/>
           <w:lang w:val="es-ES"/>
         </w:rPr>
         <w:t xml:space="preserve"> otra vez, y el ciclo se repite.</w:t>
@@ -534,8 +450,6 @@
         <w:spacing w:before="100" w:beforeAutospacing="1" w:after="100" w:afterAutospacing="1" w:line="240" w:lineRule="auto"/>
         <w:rPr>
           <w:rFonts w:ascii="Times New Roman" w:eastAsia="Times New Roman" w:hAnsi="Times New Roman" w:cs="Times New Roman"/>
-          <w:sz w:val="24"/>
-          <w:szCs w:val="24"/>
           <w:lang w:val="es-ES"/>
         </w:rPr>
       </w:pPr>
@@ -544,8 +458,6 @@
           <w:rFonts w:ascii="Times New Roman" w:eastAsia="Times New Roman" w:hAnsi="Times New Roman" w:cs="Times New Roman"/>
           <w:b/>
           <w:bCs/>
-          <w:sz w:val="24"/>
-          <w:szCs w:val="24"/>
           <w:lang w:val="es-ES"/>
         </w:rPr>
         <w:t>Área de preparación (</w:t>
@@ -556,8 +468,6 @@
           <w:rFonts w:ascii="Times New Roman" w:eastAsia="Times New Roman" w:hAnsi="Times New Roman" w:cs="Times New Roman"/>
           <w:b/>
           <w:bCs/>
-          <w:sz w:val="24"/>
-          <w:szCs w:val="24"/>
           <w:lang w:val="es-ES"/>
         </w:rPr>
         <w:t>staging</w:t>
@@ -568,8 +478,6 @@
           <w:rFonts w:ascii="Times New Roman" w:eastAsia="Times New Roman" w:hAnsi="Times New Roman" w:cs="Times New Roman"/>
           <w:b/>
           <w:bCs/>
-          <w:sz w:val="24"/>
-          <w:szCs w:val="24"/>
           <w:lang w:val="es-ES"/>
         </w:rPr>
         <w:t xml:space="preserve"> </w:t>
@@ -580,8 +488,6 @@
           <w:rFonts w:ascii="Times New Roman" w:eastAsia="Times New Roman" w:hAnsi="Times New Roman" w:cs="Times New Roman"/>
           <w:b/>
           <w:bCs/>
-          <w:sz w:val="24"/>
-          <w:szCs w:val="24"/>
           <w:lang w:val="es-ES"/>
         </w:rPr>
         <w:t>area</w:t>
@@ -592,8 +498,6 @@
           <w:rFonts w:ascii="Times New Roman" w:eastAsia="Times New Roman" w:hAnsi="Times New Roman" w:cs="Times New Roman"/>
           <w:b/>
           <w:bCs/>
-          <w:sz w:val="24"/>
-          <w:szCs w:val="24"/>
           <w:lang w:val="es-ES"/>
         </w:rPr>
         <w:t>):</w:t>
@@ -601,8 +505,6 @@
       <w:r>
         <w:rPr>
           <w:rFonts w:ascii="Times New Roman" w:eastAsia="Times New Roman" w:hAnsi="Times New Roman" w:cs="Times New Roman"/>
-          <w:sz w:val="24"/>
-          <w:szCs w:val="24"/>
           <w:lang w:val="es-ES"/>
         </w:rPr>
         <w:t xml:space="preserve"> permite elegir qué cambios entran en cada </w:t>
@@ -611,8 +513,6 @@
       <w:r>
         <w:rPr>
           <w:rFonts w:ascii="Times New Roman" w:eastAsia="Times New Roman" w:hAnsi="Times New Roman" w:cs="Times New Roman"/>
-          <w:sz w:val="24"/>
-          <w:szCs w:val="24"/>
           <w:lang w:val="es-ES"/>
         </w:rPr>
         <w:t>commit</w:t>
@@ -621,8 +521,6 @@
       <w:r>
         <w:rPr>
           <w:rFonts w:ascii="Times New Roman" w:eastAsia="Times New Roman" w:hAnsi="Times New Roman" w:cs="Times New Roman"/>
-          <w:sz w:val="24"/>
-          <w:szCs w:val="24"/>
           <w:lang w:val="es-ES"/>
         </w:rPr>
         <w:t>.</w:t>
@@ -637,8 +535,6 @@
         <w:spacing w:before="100" w:beforeAutospacing="1" w:after="100" w:afterAutospacing="1" w:line="240" w:lineRule="auto"/>
         <w:rPr>
           <w:rFonts w:ascii="Times New Roman" w:eastAsia="Times New Roman" w:hAnsi="Times New Roman" w:cs="Times New Roman"/>
-          <w:sz w:val="24"/>
-          <w:szCs w:val="24"/>
           <w:lang w:val="es-ES"/>
         </w:rPr>
       </w:pPr>
@@ -647,8 +543,6 @@
           <w:rFonts w:ascii="Times New Roman" w:eastAsia="Times New Roman" w:hAnsi="Times New Roman" w:cs="Times New Roman"/>
           <w:b/>
           <w:bCs/>
-          <w:sz w:val="24"/>
-          <w:szCs w:val="24"/>
           <w:lang w:val="es-ES"/>
         </w:rPr>
         <w:t>Historial:</w:t>
@@ -656,8 +550,6 @@
       <w:r>
         <w:rPr>
           <w:rFonts w:ascii="Times New Roman" w:eastAsia="Times New Roman" w:hAnsi="Times New Roman" w:cs="Times New Roman"/>
-          <w:sz w:val="24"/>
-          <w:szCs w:val="24"/>
           <w:lang w:val="es-ES"/>
         </w:rPr>
         <w:t xml:space="preserve"> </w:t>
@@ -665,9 +557,7 @@
       <w:proofErr w:type="spellStart"/>
       <w:r>
         <w:rPr>
-          <w:rFonts w:ascii="Courier New" w:eastAsia="Times New Roman" w:hAnsi="Courier New" w:cs="Courier New"/>
-          <w:sz w:val="20"/>
-          <w:szCs w:val="20"/>
+          <w:rFonts w:ascii="Times New Roman" w:eastAsia="Times New Roman" w:hAnsi="Times New Roman" w:cs="Times New Roman"/>
           <w:lang w:val="es-ES"/>
         </w:rPr>
         <w:t>git</w:t>
@@ -675,9 +565,7 @@
       <w:proofErr w:type="spellEnd"/>
       <w:r>
         <w:rPr>
-          <w:rFonts w:ascii="Courier New" w:eastAsia="Times New Roman" w:hAnsi="Courier New" w:cs="Courier New"/>
-          <w:sz w:val="20"/>
-          <w:szCs w:val="20"/>
+          <w:rFonts w:ascii="Times New Roman" w:eastAsia="Times New Roman" w:hAnsi="Times New Roman" w:cs="Times New Roman"/>
           <w:lang w:val="es-ES"/>
         </w:rPr>
         <w:t xml:space="preserve"> log</w:t>
@@ -685,8 +573,6 @@
       <w:r>
         <w:rPr>
           <w:rFonts w:ascii="Times New Roman" w:eastAsia="Times New Roman" w:hAnsi="Times New Roman" w:cs="Times New Roman"/>
-          <w:sz w:val="24"/>
-          <w:szCs w:val="24"/>
           <w:lang w:val="es-ES"/>
         </w:rPr>
         <w:t xml:space="preserve"> lista los </w:t>
@@ -695,8 +581,6 @@
       <w:r>
         <w:rPr>
           <w:rFonts w:ascii="Times New Roman" w:eastAsia="Times New Roman" w:hAnsi="Times New Roman" w:cs="Times New Roman"/>
-          <w:sz w:val="24"/>
-          <w:szCs w:val="24"/>
           <w:lang w:val="es-ES"/>
         </w:rPr>
         <w:t>commits</w:t>
@@ -705,8 +589,6 @@
       <w:r>
         <w:rPr>
           <w:rFonts w:ascii="Times New Roman" w:eastAsia="Times New Roman" w:hAnsi="Times New Roman" w:cs="Times New Roman"/>
-          <w:sz w:val="24"/>
-          <w:szCs w:val="24"/>
           <w:lang w:val="es-ES"/>
         </w:rPr>
         <w:t>; admite formatos compactos y filtros.</w:t>
@@ -721,8 +603,6 @@
         <w:spacing w:before="100" w:beforeAutospacing="1" w:after="100" w:afterAutospacing="1" w:line="240" w:lineRule="auto"/>
         <w:rPr>
           <w:rFonts w:ascii="Times New Roman" w:eastAsia="Times New Roman" w:hAnsi="Times New Roman" w:cs="Times New Roman"/>
-          <w:sz w:val="24"/>
-          <w:szCs w:val="24"/>
           <w:lang w:val="es-ES"/>
         </w:rPr>
       </w:pPr>
@@ -731,8 +611,6 @@
           <w:rFonts w:ascii="Times New Roman" w:eastAsia="Times New Roman" w:hAnsi="Times New Roman" w:cs="Times New Roman"/>
           <w:b/>
           <w:bCs/>
-          <w:sz w:val="24"/>
-          <w:szCs w:val="24"/>
           <w:lang w:val="es-ES"/>
         </w:rPr>
         <w:t>Deshacer:</w:t>
@@ -740,8 +618,6 @@
       <w:r>
         <w:rPr>
           <w:rFonts w:ascii="Times New Roman" w:eastAsia="Times New Roman" w:hAnsi="Times New Roman" w:cs="Times New Roman"/>
-          <w:sz w:val="24"/>
-          <w:szCs w:val="24"/>
           <w:lang w:val="es-ES"/>
         </w:rPr>
         <w:t xml:space="preserve"> corregir el último </w:t>
@@ -750,8 +626,6 @@
       <w:r>
         <w:rPr>
           <w:rFonts w:ascii="Times New Roman" w:eastAsia="Times New Roman" w:hAnsi="Times New Roman" w:cs="Times New Roman"/>
-          <w:sz w:val="24"/>
-          <w:szCs w:val="24"/>
           <w:lang w:val="es-ES"/>
         </w:rPr>
         <w:t>commit</w:t>
@@ -760,8 +634,6 @@
       <w:r>
         <w:rPr>
           <w:rFonts w:ascii="Times New Roman" w:eastAsia="Times New Roman" w:hAnsi="Times New Roman" w:cs="Times New Roman"/>
-          <w:sz w:val="24"/>
-          <w:szCs w:val="24"/>
           <w:lang w:val="es-ES"/>
         </w:rPr>
         <w:t>, sacar un archivo del área de preparación o descartar cambios locales.</w:t>
@@ -776,8 +648,6 @@
         <w:spacing w:before="100" w:beforeAutospacing="1" w:after="100" w:afterAutospacing="1" w:line="240" w:lineRule="auto"/>
         <w:rPr>
           <w:rFonts w:ascii="Times New Roman" w:eastAsia="Times New Roman" w:hAnsi="Times New Roman" w:cs="Times New Roman"/>
-          <w:sz w:val="24"/>
-          <w:szCs w:val="24"/>
           <w:lang w:val="es-ES"/>
         </w:rPr>
       </w:pPr>
@@ -786,8 +656,6 @@
           <w:rFonts w:ascii="Times New Roman" w:eastAsia="Times New Roman" w:hAnsi="Times New Roman" w:cs="Times New Roman"/>
           <w:b/>
           <w:bCs/>
-          <w:sz w:val="24"/>
-          <w:szCs w:val="24"/>
           <w:lang w:val="es-ES"/>
         </w:rPr>
         <w:t>Remotos:</w:t>
@@ -795,8 +663,6 @@
       <w:r>
         <w:rPr>
           <w:rFonts w:ascii="Times New Roman" w:eastAsia="Times New Roman" w:hAnsi="Times New Roman" w:cs="Times New Roman"/>
-          <w:sz w:val="24"/>
-          <w:szCs w:val="24"/>
           <w:lang w:val="es-ES"/>
         </w:rPr>
         <w:t xml:space="preserve"> repositorios alojados en otro lugar (como GitHub), a los que se envía (</w:t>
@@ -804,9 +670,7 @@
       <w:proofErr w:type="spellStart"/>
       <w:r>
         <w:rPr>
-          <w:rFonts w:ascii="Courier New" w:eastAsia="Times New Roman" w:hAnsi="Courier New" w:cs="Courier New"/>
-          <w:sz w:val="20"/>
-          <w:szCs w:val="20"/>
+          <w:rFonts w:ascii="Times New Roman" w:eastAsia="Times New Roman" w:hAnsi="Times New Roman" w:cs="Times New Roman"/>
           <w:lang w:val="es-ES"/>
         </w:rPr>
         <w:t>push</w:t>
@@ -815,8 +679,6 @@
       <w:r>
         <w:rPr>
           <w:rFonts w:ascii="Times New Roman" w:eastAsia="Times New Roman" w:hAnsi="Times New Roman" w:cs="Times New Roman"/>
-          <w:sz w:val="24"/>
-          <w:szCs w:val="24"/>
           <w:lang w:val="es-ES"/>
         </w:rPr>
         <w:t>) y de los que se recibe (</w:t>
@@ -824,9 +686,7 @@
       <w:proofErr w:type="spellStart"/>
       <w:r>
         <w:rPr>
-          <w:rFonts w:ascii="Courier New" w:eastAsia="Times New Roman" w:hAnsi="Courier New" w:cs="Courier New"/>
-          <w:sz w:val="20"/>
-          <w:szCs w:val="20"/>
+          <w:rFonts w:ascii="Times New Roman" w:eastAsia="Times New Roman" w:hAnsi="Times New Roman" w:cs="Times New Roman"/>
           <w:lang w:val="es-ES"/>
         </w:rPr>
         <w:t>fetch</w:t>
@@ -835,8 +695,6 @@
       <w:r>
         <w:rPr>
           <w:rFonts w:ascii="Times New Roman" w:eastAsia="Times New Roman" w:hAnsi="Times New Roman" w:cs="Times New Roman"/>
-          <w:sz w:val="24"/>
-          <w:szCs w:val="24"/>
           <w:lang w:val="es-ES"/>
         </w:rPr>
         <w:t>/</w:t>
@@ -844,9 +702,7 @@
       <w:proofErr w:type="spellStart"/>
       <w:r>
         <w:rPr>
-          <w:rFonts w:ascii="Courier New" w:eastAsia="Times New Roman" w:hAnsi="Courier New" w:cs="Courier New"/>
-          <w:sz w:val="20"/>
-          <w:szCs w:val="20"/>
+          <w:rFonts w:ascii="Times New Roman" w:eastAsia="Times New Roman" w:hAnsi="Times New Roman" w:cs="Times New Roman"/>
           <w:lang w:val="es-ES"/>
         </w:rPr>
         <w:t>pull</w:t>
@@ -855,8 +711,6 @@
       <w:r>
         <w:rPr>
           <w:rFonts w:ascii="Times New Roman" w:eastAsia="Times New Roman" w:hAnsi="Times New Roman" w:cs="Times New Roman"/>
-          <w:sz w:val="24"/>
-          <w:szCs w:val="24"/>
           <w:lang w:val="es-ES"/>
         </w:rPr>
         <w:t>).</w:t>
@@ -871,8 +725,6 @@
         <w:spacing w:before="100" w:beforeAutospacing="1" w:after="100" w:afterAutospacing="1" w:line="240" w:lineRule="auto"/>
         <w:rPr>
           <w:rFonts w:ascii="Times New Roman" w:eastAsia="Times New Roman" w:hAnsi="Times New Roman" w:cs="Times New Roman"/>
-          <w:sz w:val="24"/>
-          <w:szCs w:val="24"/>
           <w:lang w:val="es-ES"/>
         </w:rPr>
       </w:pPr>
@@ -881,8 +733,6 @@
           <w:rFonts w:ascii="Times New Roman" w:eastAsia="Times New Roman" w:hAnsi="Times New Roman" w:cs="Times New Roman"/>
           <w:b/>
           <w:bCs/>
-          <w:sz w:val="24"/>
-          <w:szCs w:val="24"/>
           <w:lang w:val="es-ES"/>
         </w:rPr>
         <w:t>Etiquetas (</w:t>
@@ -893,8 +743,6 @@
           <w:rFonts w:ascii="Times New Roman" w:eastAsia="Times New Roman" w:hAnsi="Times New Roman" w:cs="Times New Roman"/>
           <w:b/>
           <w:bCs/>
-          <w:sz w:val="24"/>
-          <w:szCs w:val="24"/>
           <w:lang w:val="es-ES"/>
         </w:rPr>
         <w:t>tags</w:t>
@@ -905,8 +753,6 @@
           <w:rFonts w:ascii="Times New Roman" w:eastAsia="Times New Roman" w:hAnsi="Times New Roman" w:cs="Times New Roman"/>
           <w:b/>
           <w:bCs/>
-          <w:sz w:val="24"/>
-          <w:szCs w:val="24"/>
           <w:lang w:val="es-ES"/>
         </w:rPr>
         <w:t>):</w:t>
@@ -914,8 +760,6 @@
       <w:r>
         <w:rPr>
           <w:rFonts w:ascii="Times New Roman" w:eastAsia="Times New Roman" w:hAnsi="Times New Roman" w:cs="Times New Roman"/>
-          <w:sz w:val="24"/>
-          <w:szCs w:val="24"/>
           <w:lang w:val="es-ES"/>
         </w:rPr>
         <w:t xml:space="preserve"> marcan versiones importantes del historial.</w:t>
@@ -930,8 +774,6 @@
         <w:spacing w:before="100" w:beforeAutospacing="1" w:after="100" w:afterAutospacing="1" w:line="240" w:lineRule="auto"/>
         <w:rPr>
           <w:rFonts w:ascii="Times New Roman" w:eastAsia="Times New Roman" w:hAnsi="Times New Roman" w:cs="Times New Roman"/>
-          <w:sz w:val="24"/>
-          <w:szCs w:val="24"/>
           <w:lang w:val="es-ES"/>
         </w:rPr>
       </w:pPr>
@@ -940,8 +782,6 @@
           <w:rFonts w:ascii="Times New Roman" w:eastAsia="Times New Roman" w:hAnsi="Times New Roman" w:cs="Times New Roman"/>
           <w:b/>
           <w:bCs/>
-          <w:sz w:val="24"/>
-          <w:szCs w:val="24"/>
           <w:lang w:val="es-ES"/>
         </w:rPr>
         <w:t>Alias:</w:t>
@@ -949,8 +789,6 @@
       <w:r>
         <w:rPr>
           <w:rFonts w:ascii="Times New Roman" w:eastAsia="Times New Roman" w:hAnsi="Times New Roman" w:cs="Times New Roman"/>
-          <w:sz w:val="24"/>
-          <w:szCs w:val="24"/>
           <w:lang w:val="es-ES"/>
         </w:rPr>
         <w:t xml:space="preserve"> atajos para comandos largos.</w:t>
@@ -958,61 +796,37 @@
     </w:p>
     <w:tbl>
       <w:tblPr>
+        <w:tblStyle w:val="Tabladecuadrcula4-nfasis1"/>
         <w:tblW w:w="3468" w:type="dxa"/>
-        <w:tblCellSpacing w:w="15" w:type="dxa"/>
-        <w:tblBorders>
-          <w:top w:val="single" w:sz="4" w:space="0" w:color="auto"/>
-          <w:left w:val="single" w:sz="4" w:space="0" w:color="auto"/>
-          <w:bottom w:val="single" w:sz="4" w:space="0" w:color="auto"/>
-          <w:right w:val="single" w:sz="4" w:space="0" w:color="auto"/>
-          <w:insideH w:val="single" w:sz="4" w:space="0" w:color="auto"/>
-          <w:insideV w:val="single" w:sz="4" w:space="0" w:color="auto"/>
-        </w:tblBorders>
-        <w:tblCellMar>
-          <w:top w:w="15" w:type="dxa"/>
-          <w:left w:w="15" w:type="dxa"/>
-          <w:bottom w:w="15" w:type="dxa"/>
-          <w:right w:w="15" w:type="dxa"/>
-        </w:tblCellMar>
         <w:tblLook w:val="04A0" w:firstRow="1" w:lastRow="0" w:firstColumn="1" w:lastColumn="0" w:noHBand="0" w:noVBand="1"/>
       </w:tblPr>
       <w:tblGrid>
-        <w:gridCol w:w="954"/>
-        <w:gridCol w:w="1154"/>
-        <w:gridCol w:w="6720"/>
+        <w:gridCol w:w="982"/>
+        <w:gridCol w:w="1176"/>
+        <w:gridCol w:w="6670"/>
       </w:tblGrid>
       <w:tr>
         <w:trPr>
+          <w:cnfStyle w:val="100000000000" w:firstRow="1" w:lastRow="0" w:firstColumn="0" w:lastColumn="0" w:oddVBand="0" w:evenVBand="0" w:oddHBand="0" w:evenHBand="0" w:firstRowFirstColumn="0" w:firstRowLastColumn="0" w:lastRowFirstColumn="0" w:lastRowLastColumn="0"/>
           <w:trHeight w:val="531"/>
-          <w:tblHeader/>
-          <w:tblCellSpacing w:w="15" w:type="dxa"/>
         </w:trPr>
         <w:tc>
           <w:tcPr>
-            <w:tcW w:w="0" w:type="auto"/>
-            <w:vAlign w:val="center"/>
-            <w:hideMark/>
-          </w:tcPr>
-          <w:p>
-            <w:pPr>
-              <w:spacing w:after="0" w:line="240" w:lineRule="auto"/>
+            <w:cnfStyle w:val="001000000000" w:firstRow="0" w:lastRow="0" w:firstColumn="1" w:lastColumn="0" w:oddVBand="0" w:evenVBand="0" w:oddHBand="0" w:evenHBand="0" w:firstRowFirstColumn="0" w:firstRowLastColumn="0" w:lastRowFirstColumn="0" w:lastRowLastColumn="0"/>
+            <w:tcW w:w="0" w:type="auto"/>
+            <w:hideMark/>
+          </w:tcPr>
+          <w:p>
+            <w:pPr>
               <w:jc w:val="center"/>
               <w:rPr>
                 <w:rFonts w:ascii="Times New Roman" w:eastAsia="Times New Roman" w:hAnsi="Times New Roman" w:cs="Times New Roman"/>
-                <w:b/>
-                <w:bCs/>
-                <w:sz w:val="24"/>
-                <w:szCs w:val="24"/>
-              </w:rPr>
-            </w:pPr>
-            <w:proofErr w:type="spellStart"/>
-            <w:r>
-              <w:rPr>
-                <w:rFonts w:ascii="Times New Roman" w:eastAsia="Times New Roman" w:hAnsi="Times New Roman" w:cs="Times New Roman"/>
-                <w:b/>
-                <w:bCs/>
-                <w:sz w:val="24"/>
-                <w:szCs w:val="24"/>
+              </w:rPr>
+            </w:pPr>
+            <w:proofErr w:type="spellStart"/>
+            <w:r>
+              <w:rPr>
+                <w:rFonts w:ascii="Times New Roman" w:eastAsia="Times New Roman" w:hAnsi="Times New Roman" w:cs="Times New Roman"/>
               </w:rPr>
               <w:t>Comando</w:t>
             </w:r>
@@ -1022,28 +836,19 @@
         <w:tc>
           <w:tcPr>
             <w:tcW w:w="0" w:type="auto"/>
-            <w:vAlign w:val="center"/>
-            <w:hideMark/>
-          </w:tcPr>
-          <w:p>
-            <w:pPr>
-              <w:spacing w:after="0" w:line="240" w:lineRule="auto"/>
+            <w:hideMark/>
+          </w:tcPr>
+          <w:p>
+            <w:pPr>
               <w:jc w:val="center"/>
-              <w:rPr>
-                <w:rFonts w:ascii="Times New Roman" w:eastAsia="Times New Roman" w:hAnsi="Times New Roman" w:cs="Times New Roman"/>
-                <w:b/>
-                <w:bCs/>
-                <w:sz w:val="24"/>
-                <w:szCs w:val="24"/>
-              </w:rPr>
-            </w:pPr>
-            <w:r>
-              <w:rPr>
-                <w:rFonts w:ascii="Times New Roman" w:eastAsia="Times New Roman" w:hAnsi="Times New Roman" w:cs="Times New Roman"/>
-                <w:b/>
-                <w:bCs/>
-                <w:sz w:val="24"/>
-                <w:szCs w:val="24"/>
+              <w:cnfStyle w:val="100000000000" w:firstRow="1" w:lastRow="0" w:firstColumn="0" w:lastColumn="0" w:oddVBand="0" w:evenVBand="0" w:oddHBand="0" w:evenHBand="0" w:firstRowFirstColumn="0" w:firstRowLastColumn="0" w:lastRowFirstColumn="0" w:lastRowLastColumn="0"/>
+              <w:rPr>
+                <w:rFonts w:ascii="Times New Roman" w:eastAsia="Times New Roman" w:hAnsi="Times New Roman" w:cs="Times New Roman"/>
+              </w:rPr>
+            </w:pPr>
+            <w:r>
+              <w:rPr>
+                <w:rFonts w:ascii="Times New Roman" w:eastAsia="Times New Roman" w:hAnsi="Times New Roman" w:cs="Times New Roman"/>
               </w:rPr>
               <w:t xml:space="preserve">Para </w:t>
             </w:r>
@@ -1051,10 +856,6 @@
             <w:r>
               <w:rPr>
                 <w:rFonts w:ascii="Times New Roman" w:eastAsia="Times New Roman" w:hAnsi="Times New Roman" w:cs="Times New Roman"/>
-                <w:b/>
-                <w:bCs/>
-                <w:sz w:val="24"/>
-                <w:szCs w:val="24"/>
               </w:rPr>
               <w:t>qué</w:t>
             </w:r>
@@ -1062,10 +863,6 @@
             <w:r>
               <w:rPr>
                 <w:rFonts w:ascii="Times New Roman" w:eastAsia="Times New Roman" w:hAnsi="Times New Roman" w:cs="Times New Roman"/>
-                <w:b/>
-                <w:bCs/>
-                <w:sz w:val="24"/>
-                <w:szCs w:val="24"/>
               </w:rPr>
               <w:t xml:space="preserve"> </w:t>
             </w:r>
@@ -1073,10 +870,6 @@
             <w:r>
               <w:rPr>
                 <w:rFonts w:ascii="Times New Roman" w:eastAsia="Times New Roman" w:hAnsi="Times New Roman" w:cs="Times New Roman"/>
-                <w:b/>
-                <w:bCs/>
-                <w:sz w:val="24"/>
-                <w:szCs w:val="24"/>
               </w:rPr>
               <w:t>sirve</w:t>
             </w:r>
@@ -1086,29 +879,20 @@
         <w:tc>
           <w:tcPr>
             <w:tcW w:w="0" w:type="auto"/>
-            <w:vAlign w:val="center"/>
-            <w:hideMark/>
-          </w:tcPr>
-          <w:p>
-            <w:pPr>
-              <w:spacing w:after="0" w:line="240" w:lineRule="auto"/>
+            <w:hideMark/>
+          </w:tcPr>
+          <w:p>
+            <w:pPr>
               <w:jc w:val="center"/>
-              <w:rPr>
-                <w:rFonts w:ascii="Times New Roman" w:eastAsia="Times New Roman" w:hAnsi="Times New Roman" w:cs="Times New Roman"/>
-                <w:b/>
-                <w:bCs/>
-                <w:sz w:val="24"/>
-                <w:szCs w:val="24"/>
-              </w:rPr>
-            </w:pPr>
-            <w:proofErr w:type="spellStart"/>
-            <w:r>
-              <w:rPr>
-                <w:rFonts w:ascii="Times New Roman" w:eastAsia="Times New Roman" w:hAnsi="Times New Roman" w:cs="Times New Roman"/>
-                <w:b/>
-                <w:bCs/>
-                <w:sz w:val="24"/>
-                <w:szCs w:val="24"/>
+              <w:cnfStyle w:val="100000000000" w:firstRow="1" w:lastRow="0" w:firstColumn="0" w:lastColumn="0" w:oddVBand="0" w:evenVBand="0" w:oddHBand="0" w:evenHBand="0" w:firstRowFirstColumn="0" w:firstRowLastColumn="0" w:lastRowFirstColumn="0" w:lastRowLastColumn="0"/>
+              <w:rPr>
+                <w:rFonts w:ascii="Times New Roman" w:eastAsia="Times New Roman" w:hAnsi="Times New Roman" w:cs="Times New Roman"/>
+              </w:rPr>
+            </w:pPr>
+            <w:proofErr w:type="spellStart"/>
+            <w:r>
+              <w:rPr>
+                <w:rFonts w:ascii="Times New Roman" w:eastAsia="Times New Roman" w:hAnsi="Times New Roman" w:cs="Times New Roman"/>
               </w:rPr>
               <w:t>Ejemplo</w:t>
             </w:r>
@@ -1118,48 +902,39 @@
       </w:tr>
       <w:tr>
         <w:trPr>
+          <w:cnfStyle w:val="000000100000" w:firstRow="0" w:lastRow="0" w:firstColumn="0" w:lastColumn="0" w:oddVBand="0" w:evenVBand="0" w:oddHBand="1" w:evenHBand="0" w:firstRowFirstColumn="0" w:firstRowLastColumn="0" w:lastRowFirstColumn="0" w:lastRowLastColumn="0"/>
           <w:trHeight w:val="804"/>
-          <w:tblCellSpacing w:w="15" w:type="dxa"/>
         </w:trPr>
         <w:tc>
           <w:tcPr>
-            <w:tcW w:w="0" w:type="auto"/>
-            <w:vAlign w:val="center"/>
-            <w:hideMark/>
-          </w:tcPr>
-          <w:p>
-            <w:pPr>
-              <w:spacing w:after="0" w:line="240" w:lineRule="auto"/>
-              <w:rPr>
-                <w:rFonts w:ascii="Times New Roman" w:eastAsia="Times New Roman" w:hAnsi="Times New Roman" w:cs="Times New Roman"/>
-                <w:sz w:val="24"/>
-                <w:szCs w:val="24"/>
-              </w:rPr>
-            </w:pPr>
-            <w:proofErr w:type="spellStart"/>
-            <w:r>
-              <w:rPr>
-                <w:rFonts w:ascii="Courier New" w:eastAsia="Times New Roman" w:hAnsi="Courier New" w:cs="Courier New"/>
-                <w:sz w:val="20"/>
-                <w:szCs w:val="20"/>
+            <w:cnfStyle w:val="001000000000" w:firstRow="0" w:lastRow="0" w:firstColumn="1" w:lastColumn="0" w:oddVBand="0" w:evenVBand="0" w:oddHBand="0" w:evenHBand="0" w:firstRowFirstColumn="0" w:firstRowLastColumn="0" w:lastRowFirstColumn="0" w:lastRowLastColumn="0"/>
+            <w:tcW w:w="0" w:type="auto"/>
+            <w:hideMark/>
+          </w:tcPr>
+          <w:p>
+            <w:pPr>
+              <w:rPr>
+                <w:rFonts w:ascii="Times New Roman" w:eastAsia="Times New Roman" w:hAnsi="Times New Roman" w:cs="Times New Roman"/>
+              </w:rPr>
+            </w:pPr>
+            <w:proofErr w:type="spellStart"/>
+            <w:r>
+              <w:rPr>
+                <w:rFonts w:ascii="Times New Roman" w:eastAsia="Times New Roman" w:hAnsi="Times New Roman" w:cs="Times New Roman"/>
               </w:rPr>
               <w:t>git</w:t>
             </w:r>
             <w:proofErr w:type="spellEnd"/>
             <w:r>
               <w:rPr>
-                <w:rFonts w:ascii="Courier New" w:eastAsia="Times New Roman" w:hAnsi="Courier New" w:cs="Courier New"/>
-                <w:sz w:val="20"/>
-                <w:szCs w:val="20"/>
+                <w:rFonts w:ascii="Times New Roman" w:eastAsia="Times New Roman" w:hAnsi="Times New Roman" w:cs="Times New Roman"/>
               </w:rPr>
               <w:t xml:space="preserve"> </w:t>
             </w:r>
             <w:proofErr w:type="spellStart"/>
             <w:r>
               <w:rPr>
-                <w:rFonts w:ascii="Courier New" w:eastAsia="Times New Roman" w:hAnsi="Courier New" w:cs="Courier New"/>
-                <w:sz w:val="20"/>
-                <w:szCs w:val="20"/>
+                <w:rFonts w:ascii="Times New Roman" w:eastAsia="Times New Roman" w:hAnsi="Times New Roman" w:cs="Times New Roman"/>
               </w:rPr>
               <w:t>init</w:t>
             </w:r>
@@ -1169,24 +944,19 @@
         <w:tc>
           <w:tcPr>
             <w:tcW w:w="0" w:type="auto"/>
-            <w:vAlign w:val="center"/>
-            <w:hideMark/>
-          </w:tcPr>
-          <w:p>
-            <w:pPr>
-              <w:spacing w:after="0" w:line="240" w:lineRule="auto"/>
-              <w:rPr>
-                <w:rFonts w:ascii="Times New Roman" w:eastAsia="Times New Roman" w:hAnsi="Times New Roman" w:cs="Times New Roman"/>
-                <w:sz w:val="24"/>
-                <w:szCs w:val="24"/>
-              </w:rPr>
-            </w:pPr>
-            <w:proofErr w:type="spellStart"/>
-            <w:r>
-              <w:rPr>
-                <w:rFonts w:ascii="Times New Roman" w:eastAsia="Times New Roman" w:hAnsi="Times New Roman" w:cs="Times New Roman"/>
-                <w:sz w:val="24"/>
-                <w:szCs w:val="24"/>
+            <w:hideMark/>
+          </w:tcPr>
+          <w:p>
+            <w:pPr>
+              <w:cnfStyle w:val="000000100000" w:firstRow="0" w:lastRow="0" w:firstColumn="0" w:lastColumn="0" w:oddVBand="0" w:evenVBand="0" w:oddHBand="1" w:evenHBand="0" w:firstRowFirstColumn="0" w:firstRowLastColumn="0" w:lastRowFirstColumn="0" w:lastRowLastColumn="0"/>
+              <w:rPr>
+                <w:rFonts w:ascii="Times New Roman" w:eastAsia="Times New Roman" w:hAnsi="Times New Roman" w:cs="Times New Roman"/>
+              </w:rPr>
+            </w:pPr>
+            <w:proofErr w:type="spellStart"/>
+            <w:r>
+              <w:rPr>
+                <w:rFonts w:ascii="Times New Roman" w:eastAsia="Times New Roman" w:hAnsi="Times New Roman" w:cs="Times New Roman"/>
               </w:rPr>
               <w:t>Crear</w:t>
             </w:r>
@@ -1194,8 +964,6 @@
             <w:r>
               <w:rPr>
                 <w:rFonts w:ascii="Times New Roman" w:eastAsia="Times New Roman" w:hAnsi="Times New Roman" w:cs="Times New Roman"/>
-                <w:sz w:val="24"/>
-                <w:szCs w:val="24"/>
               </w:rPr>
               <w:t xml:space="preserve"> un </w:t>
             </w:r>
@@ -1203,8 +971,6 @@
             <w:r>
               <w:rPr>
                 <w:rFonts w:ascii="Times New Roman" w:eastAsia="Times New Roman" w:hAnsi="Times New Roman" w:cs="Times New Roman"/>
-                <w:sz w:val="24"/>
-                <w:szCs w:val="24"/>
               </w:rPr>
               <w:t>repositorio</w:t>
             </w:r>
@@ -1212,8 +978,6 @@
             <w:r>
               <w:rPr>
                 <w:rFonts w:ascii="Times New Roman" w:eastAsia="Times New Roman" w:hAnsi="Times New Roman" w:cs="Times New Roman"/>
-                <w:sz w:val="24"/>
-                <w:szCs w:val="24"/>
               </w:rPr>
               <w:t xml:space="preserve"> </w:t>
             </w:r>
@@ -1221,8 +985,6 @@
             <w:r>
               <w:rPr>
                 <w:rFonts w:ascii="Times New Roman" w:eastAsia="Times New Roman" w:hAnsi="Times New Roman" w:cs="Times New Roman"/>
-                <w:sz w:val="24"/>
-                <w:szCs w:val="24"/>
               </w:rPr>
               <w:t>nuevo</w:t>
             </w:r>
@@ -1232,42 +994,33 @@
         <w:tc>
           <w:tcPr>
             <w:tcW w:w="0" w:type="auto"/>
-            <w:vAlign w:val="center"/>
-            <w:hideMark/>
-          </w:tcPr>
-          <w:p>
-            <w:pPr>
-              <w:spacing w:after="0" w:line="240" w:lineRule="auto"/>
-              <w:rPr>
-                <w:rFonts w:ascii="Times New Roman" w:eastAsia="Times New Roman" w:hAnsi="Times New Roman" w:cs="Times New Roman"/>
-                <w:sz w:val="24"/>
-                <w:szCs w:val="24"/>
-              </w:rPr>
-            </w:pPr>
-            <w:proofErr w:type="spellStart"/>
-            <w:r>
-              <w:rPr>
-                <w:rFonts w:ascii="Courier New" w:eastAsia="Times New Roman" w:hAnsi="Courier New" w:cs="Courier New"/>
-                <w:sz w:val="20"/>
-                <w:szCs w:val="20"/>
+            <w:hideMark/>
+          </w:tcPr>
+          <w:p>
+            <w:pPr>
+              <w:cnfStyle w:val="000000100000" w:firstRow="0" w:lastRow="0" w:firstColumn="0" w:lastColumn="0" w:oddVBand="0" w:evenVBand="0" w:oddHBand="1" w:evenHBand="0" w:firstRowFirstColumn="0" w:firstRowLastColumn="0" w:lastRowFirstColumn="0" w:lastRowLastColumn="0"/>
+              <w:rPr>
+                <w:rFonts w:ascii="Times New Roman" w:eastAsia="Times New Roman" w:hAnsi="Times New Roman" w:cs="Times New Roman"/>
+              </w:rPr>
+            </w:pPr>
+            <w:proofErr w:type="spellStart"/>
+            <w:r>
+              <w:rPr>
+                <w:rFonts w:ascii="Times New Roman" w:eastAsia="Times New Roman" w:hAnsi="Times New Roman" w:cs="Times New Roman"/>
               </w:rPr>
               <w:t>git</w:t>
             </w:r>
             <w:proofErr w:type="spellEnd"/>
             <w:r>
               <w:rPr>
-                <w:rFonts w:ascii="Courier New" w:eastAsia="Times New Roman" w:hAnsi="Courier New" w:cs="Courier New"/>
-                <w:sz w:val="20"/>
-                <w:szCs w:val="20"/>
+                <w:rFonts w:ascii="Times New Roman" w:eastAsia="Times New Roman" w:hAnsi="Times New Roman" w:cs="Times New Roman"/>
               </w:rPr>
               <w:t xml:space="preserve"> </w:t>
             </w:r>
             <w:proofErr w:type="spellStart"/>
             <w:r>
               <w:rPr>
-                <w:rFonts w:ascii="Courier New" w:eastAsia="Times New Roman" w:hAnsi="Courier New" w:cs="Courier New"/>
-                <w:sz w:val="20"/>
-                <w:szCs w:val="20"/>
+                <w:rFonts w:ascii="Times New Roman" w:eastAsia="Times New Roman" w:hAnsi="Times New Roman" w:cs="Times New Roman"/>
               </w:rPr>
               <w:t>init</w:t>
             </w:r>
@@ -1278,38 +1031,30 @@
       <w:tr>
         <w:trPr>
           <w:trHeight w:val="2383"/>
-          <w:tblCellSpacing w:w="15" w:type="dxa"/>
         </w:trPr>
         <w:tc>
           <w:tcPr>
-            <w:tcW w:w="0" w:type="auto"/>
-            <w:vAlign w:val="center"/>
-            <w:hideMark/>
-          </w:tcPr>
-          <w:p>
-            <w:pPr>
-              <w:spacing w:after="0" w:line="240" w:lineRule="auto"/>
-              <w:rPr>
-                <w:rFonts w:ascii="Times New Roman" w:eastAsia="Times New Roman" w:hAnsi="Times New Roman" w:cs="Times New Roman"/>
-                <w:sz w:val="24"/>
-                <w:szCs w:val="24"/>
-              </w:rPr>
-            </w:pPr>
-            <w:proofErr w:type="spellStart"/>
-            <w:r>
-              <w:rPr>
-                <w:rFonts w:ascii="Courier New" w:eastAsia="Times New Roman" w:hAnsi="Courier New" w:cs="Courier New"/>
-                <w:sz w:val="20"/>
-                <w:szCs w:val="20"/>
+            <w:cnfStyle w:val="001000000000" w:firstRow="0" w:lastRow="0" w:firstColumn="1" w:lastColumn="0" w:oddVBand="0" w:evenVBand="0" w:oddHBand="0" w:evenHBand="0" w:firstRowFirstColumn="0" w:firstRowLastColumn="0" w:lastRowFirstColumn="0" w:lastRowLastColumn="0"/>
+            <w:tcW w:w="0" w:type="auto"/>
+            <w:hideMark/>
+          </w:tcPr>
+          <w:p>
+            <w:pPr>
+              <w:rPr>
+                <w:rFonts w:ascii="Times New Roman" w:eastAsia="Times New Roman" w:hAnsi="Times New Roman" w:cs="Times New Roman"/>
+              </w:rPr>
+            </w:pPr>
+            <w:proofErr w:type="spellStart"/>
+            <w:r>
+              <w:rPr>
+                <w:rFonts w:ascii="Times New Roman" w:eastAsia="Times New Roman" w:hAnsi="Times New Roman" w:cs="Times New Roman"/>
               </w:rPr>
               <w:t>git</w:t>
             </w:r>
             <w:proofErr w:type="spellEnd"/>
             <w:r>
               <w:rPr>
-                <w:rFonts w:ascii="Courier New" w:eastAsia="Times New Roman" w:hAnsi="Courier New" w:cs="Courier New"/>
-                <w:sz w:val="20"/>
-                <w:szCs w:val="20"/>
+                <w:rFonts w:ascii="Times New Roman" w:eastAsia="Times New Roman" w:hAnsi="Times New Roman" w:cs="Times New Roman"/>
               </w:rPr>
               <w:t xml:space="preserve"> clone</w:t>
             </w:r>
@@ -1318,24 +1063,19 @@
         <w:tc>
           <w:tcPr>
             <w:tcW w:w="0" w:type="auto"/>
-            <w:vAlign w:val="center"/>
-            <w:hideMark/>
-          </w:tcPr>
-          <w:p>
-            <w:pPr>
-              <w:spacing w:after="0" w:line="240" w:lineRule="auto"/>
-              <w:rPr>
-                <w:rFonts w:ascii="Times New Roman" w:eastAsia="Times New Roman" w:hAnsi="Times New Roman" w:cs="Times New Roman"/>
-                <w:sz w:val="24"/>
-                <w:szCs w:val="24"/>
-              </w:rPr>
-            </w:pPr>
-            <w:proofErr w:type="spellStart"/>
-            <w:r>
-              <w:rPr>
-                <w:rFonts w:ascii="Times New Roman" w:eastAsia="Times New Roman" w:hAnsi="Times New Roman" w:cs="Times New Roman"/>
-                <w:sz w:val="24"/>
-                <w:szCs w:val="24"/>
+            <w:hideMark/>
+          </w:tcPr>
+          <w:p>
+            <w:pPr>
+              <w:cnfStyle w:val="000000000000" w:firstRow="0" w:lastRow="0" w:firstColumn="0" w:lastColumn="0" w:oddVBand="0" w:evenVBand="0" w:oddHBand="0" w:evenHBand="0" w:firstRowFirstColumn="0" w:firstRowLastColumn="0" w:lastRowFirstColumn="0" w:lastRowLastColumn="0"/>
+              <w:rPr>
+                <w:rFonts w:ascii="Times New Roman" w:eastAsia="Times New Roman" w:hAnsi="Times New Roman" w:cs="Times New Roman"/>
+              </w:rPr>
+            </w:pPr>
+            <w:proofErr w:type="spellStart"/>
+            <w:r>
+              <w:rPr>
+                <w:rFonts w:ascii="Times New Roman" w:eastAsia="Times New Roman" w:hAnsi="Times New Roman" w:cs="Times New Roman"/>
               </w:rPr>
               <w:t>Copiar</w:t>
             </w:r>
@@ -1343,8 +1083,6 @@
             <w:r>
               <w:rPr>
                 <w:rFonts w:ascii="Times New Roman" w:eastAsia="Times New Roman" w:hAnsi="Times New Roman" w:cs="Times New Roman"/>
-                <w:sz w:val="24"/>
-                <w:szCs w:val="24"/>
               </w:rPr>
               <w:t xml:space="preserve"> un </w:t>
             </w:r>
@@ -1352,8 +1090,6 @@
             <w:r>
               <w:rPr>
                 <w:rFonts w:ascii="Times New Roman" w:eastAsia="Times New Roman" w:hAnsi="Times New Roman" w:cs="Times New Roman"/>
-                <w:sz w:val="24"/>
-                <w:szCs w:val="24"/>
               </w:rPr>
               <w:t>repositorio</w:t>
             </w:r>
@@ -1361,8 +1097,6 @@
             <w:r>
               <w:rPr>
                 <w:rFonts w:ascii="Times New Roman" w:eastAsia="Times New Roman" w:hAnsi="Times New Roman" w:cs="Times New Roman"/>
-                <w:sz w:val="24"/>
-                <w:szCs w:val="24"/>
               </w:rPr>
               <w:t xml:space="preserve"> </w:t>
             </w:r>
@@ -1370,8 +1104,6 @@
             <w:r>
               <w:rPr>
                 <w:rFonts w:ascii="Times New Roman" w:eastAsia="Times New Roman" w:hAnsi="Times New Roman" w:cs="Times New Roman"/>
-                <w:sz w:val="24"/>
-                <w:szCs w:val="24"/>
               </w:rPr>
               <w:t>remoto</w:t>
             </w:r>
@@ -1381,26 +1113,21 @@
         <w:tc>
           <w:tcPr>
             <w:tcW w:w="0" w:type="auto"/>
-            <w:vAlign w:val="center"/>
-            <w:hideMark/>
-          </w:tcPr>
-          <w:p>
-            <w:pPr>
-              <w:spacing w:after="0" w:line="240" w:lineRule="auto"/>
-              <w:rPr>
-                <w:rFonts w:ascii="Times New Roman" w:eastAsia="Times New Roman" w:hAnsi="Times New Roman" w:cs="Times New Roman"/>
-                <w:sz w:val="24"/>
-                <w:szCs w:val="24"/>
-              </w:rPr>
-            </w:pPr>
-            <w:r>
-              <w:rPr>
-                <w:rFonts w:ascii="Courier New" w:eastAsia="Times New Roman" w:hAnsi="Courier New" w:cs="Courier New"/>
-                <w:sz w:val="20"/>
-                <w:szCs w:val="20"/>
+            <w:hideMark/>
+          </w:tcPr>
+          <w:p>
+            <w:pPr>
+              <w:cnfStyle w:val="000000000000" w:firstRow="0" w:lastRow="0" w:firstColumn="0" w:lastColumn="0" w:oddVBand="0" w:evenVBand="0" w:oddHBand="0" w:evenHBand="0" w:firstRowFirstColumn="0" w:firstRowLastColumn="0" w:lastRowFirstColumn="0" w:lastRowLastColumn="0"/>
+              <w:rPr>
+                <w:rFonts w:ascii="Times New Roman" w:eastAsia="Times New Roman" w:hAnsi="Times New Roman" w:cs="Times New Roman"/>
+              </w:rPr>
+            </w:pPr>
+            <w:r>
+              <w:rPr>
+                <w:rFonts w:ascii="Times New Roman" w:eastAsia="Times New Roman" w:hAnsi="Times New Roman" w:cs="Times New Roman"/>
               </w:rPr>
               <w:drawing>
-                <wp:inline distT="0" distB="0" distL="0" distR="0" wp14:anchorId="321817D2" wp14:editId="605135E7">
+                <wp:inline distT="0" distB="0" distL="0" distR="0" wp14:anchorId="3F0B2E1F" wp14:editId="2AF5406B">
                   <wp:extent cx="4906060" cy="1552792"/>
                   <wp:effectExtent l="0" t="0" r="0" b="9525"/>
                   <wp:docPr id="2" name="Imagen 2"/>
@@ -1440,30 +1167,25 @@
       </w:tr>
       <w:tr>
         <w:trPr>
+          <w:cnfStyle w:val="000000100000" w:firstRow="0" w:lastRow="0" w:firstColumn="0" w:lastColumn="0" w:oddVBand="0" w:evenVBand="0" w:oddHBand="1" w:evenHBand="0" w:firstRowFirstColumn="0" w:firstRowLastColumn="0" w:lastRowFirstColumn="0" w:lastRowLastColumn="0"/>
           <w:trHeight w:val="2931"/>
-          <w:tblCellSpacing w:w="15" w:type="dxa"/>
         </w:trPr>
         <w:tc>
           <w:tcPr>
-            <w:tcW w:w="0" w:type="auto"/>
-            <w:vAlign w:val="center"/>
-            <w:hideMark/>
-          </w:tcPr>
-          <w:p>
-            <w:pPr>
-              <w:spacing w:after="0" w:line="240" w:lineRule="auto"/>
-              <w:rPr>
-                <w:rFonts w:ascii="Times New Roman" w:eastAsia="Times New Roman" w:hAnsi="Times New Roman" w:cs="Times New Roman"/>
-                <w:sz w:val="24"/>
-                <w:szCs w:val="24"/>
-              </w:rPr>
-            </w:pPr>
-            <w:proofErr w:type="spellStart"/>
-            <w:r>
-              <w:rPr>
-                <w:rFonts w:ascii="Courier New" w:eastAsia="Times New Roman" w:hAnsi="Courier New" w:cs="Courier New"/>
-                <w:sz w:val="20"/>
-                <w:szCs w:val="20"/>
+            <w:cnfStyle w:val="001000000000" w:firstRow="0" w:lastRow="0" w:firstColumn="1" w:lastColumn="0" w:oddVBand="0" w:evenVBand="0" w:oddHBand="0" w:evenHBand="0" w:firstRowFirstColumn="0" w:firstRowLastColumn="0" w:lastRowFirstColumn="0" w:lastRowLastColumn="0"/>
+            <w:tcW w:w="0" w:type="auto"/>
+            <w:hideMark/>
+          </w:tcPr>
+          <w:p>
+            <w:pPr>
+              <w:rPr>
+                <w:rFonts w:ascii="Times New Roman" w:eastAsia="Times New Roman" w:hAnsi="Times New Roman" w:cs="Times New Roman"/>
+              </w:rPr>
+            </w:pPr>
+            <w:proofErr w:type="spellStart"/>
+            <w:r>
+              <w:rPr>
+                <w:rFonts w:ascii="Times New Roman" w:eastAsia="Times New Roman" w:hAnsi="Times New Roman" w:cs="Times New Roman"/>
               </w:rPr>
               <w:lastRenderedPageBreak/>
               <w:t>git</w:t>
@@ -1471,9 +1193,7 @@
             <w:proofErr w:type="spellEnd"/>
             <w:r>
               <w:rPr>
-                <w:rFonts w:ascii="Courier New" w:eastAsia="Times New Roman" w:hAnsi="Courier New" w:cs="Courier New"/>
-                <w:sz w:val="20"/>
-                <w:szCs w:val="20"/>
+                <w:rFonts w:ascii="Times New Roman" w:eastAsia="Times New Roman" w:hAnsi="Times New Roman" w:cs="Times New Roman"/>
               </w:rPr>
               <w:t xml:space="preserve"> status</w:t>
             </w:r>
@@ -1482,24 +1202,19 @@
         <w:tc>
           <w:tcPr>
             <w:tcW w:w="0" w:type="auto"/>
-            <w:vAlign w:val="center"/>
-            <w:hideMark/>
-          </w:tcPr>
-          <w:p>
-            <w:pPr>
-              <w:spacing w:after="0" w:line="240" w:lineRule="auto"/>
-              <w:rPr>
-                <w:rFonts w:ascii="Times New Roman" w:eastAsia="Times New Roman" w:hAnsi="Times New Roman" w:cs="Times New Roman"/>
-                <w:sz w:val="24"/>
-                <w:szCs w:val="24"/>
+            <w:hideMark/>
+          </w:tcPr>
+          <w:p>
+            <w:pPr>
+              <w:cnfStyle w:val="000000100000" w:firstRow="0" w:lastRow="0" w:firstColumn="0" w:lastColumn="0" w:oddVBand="0" w:evenVBand="0" w:oddHBand="1" w:evenHBand="0" w:firstRowFirstColumn="0" w:firstRowLastColumn="0" w:lastRowFirstColumn="0" w:lastRowLastColumn="0"/>
+              <w:rPr>
+                <w:rFonts w:ascii="Times New Roman" w:eastAsia="Times New Roman" w:hAnsi="Times New Roman" w:cs="Times New Roman"/>
                 <w:lang w:val="es-ES"/>
               </w:rPr>
             </w:pPr>
             <w:r>
               <w:rPr>
                 <w:rFonts w:ascii="Times New Roman" w:eastAsia="Times New Roman" w:hAnsi="Times New Roman" w:cs="Times New Roman"/>
-                <w:sz w:val="24"/>
-                <w:szCs w:val="24"/>
                 <w:lang w:val="es-ES"/>
               </w:rPr>
               <w:t>Ver el estado de los archivos</w:t>
@@ -1509,27 +1224,21 @@
         <w:tc>
           <w:tcPr>
             <w:tcW w:w="0" w:type="auto"/>
-            <w:vAlign w:val="center"/>
-            <w:hideMark/>
-          </w:tcPr>
-          <w:p>
-            <w:pPr>
-              <w:spacing w:after="0" w:line="240" w:lineRule="auto"/>
-              <w:rPr>
-                <w:rFonts w:ascii="Times New Roman" w:eastAsia="Times New Roman" w:hAnsi="Times New Roman" w:cs="Times New Roman"/>
-                <w:sz w:val="24"/>
-                <w:szCs w:val="24"/>
-              </w:rPr>
-            </w:pPr>
-            <w:bookmarkStart w:id="0" w:name="_GoBack"/>
-            <w:r>
-              <w:rPr>
-                <w:rFonts w:ascii="Courier New" w:eastAsia="Times New Roman" w:hAnsi="Courier New" w:cs="Courier New"/>
-                <w:sz w:val="20"/>
-                <w:szCs w:val="20"/>
+            <w:hideMark/>
+          </w:tcPr>
+          <w:p>
+            <w:pPr>
+              <w:cnfStyle w:val="000000100000" w:firstRow="0" w:lastRow="0" w:firstColumn="0" w:lastColumn="0" w:oddVBand="0" w:evenVBand="0" w:oddHBand="1" w:evenHBand="0" w:firstRowFirstColumn="0" w:firstRowLastColumn="0" w:lastRowFirstColumn="0" w:lastRowLastColumn="0"/>
+              <w:rPr>
+                <w:rFonts w:ascii="Times New Roman" w:eastAsia="Times New Roman" w:hAnsi="Times New Roman" w:cs="Times New Roman"/>
+              </w:rPr>
+            </w:pPr>
+            <w:r>
+              <w:rPr>
+                <w:rFonts w:ascii="Times New Roman" w:eastAsia="Times New Roman" w:hAnsi="Times New Roman" w:cs="Times New Roman"/>
               </w:rPr>
               <w:drawing>
-                <wp:inline distT="0" distB="0" distL="0" distR="0" wp14:anchorId="53DDC5DD" wp14:editId="0171D6E8">
+                <wp:inline distT="0" distB="0" distL="0" distR="0" wp14:anchorId="1DB50497" wp14:editId="447DE5C7">
                   <wp:extent cx="4006614" cy="1923415"/>
                   <wp:effectExtent l="0" t="0" r="0" b="635"/>
                   <wp:docPr id="1" name="Imagen 1"/>
@@ -1564,45 +1273,36 @@
                 </wp:inline>
               </w:drawing>
             </w:r>
-            <w:bookmarkEnd w:id="0"/>
           </w:p>
         </w:tc>
       </w:tr>
       <w:tr>
         <w:trPr>
           <w:trHeight w:val="3093"/>
-          <w:tblCellSpacing w:w="15" w:type="dxa"/>
         </w:trPr>
         <w:tc>
           <w:tcPr>
-            <w:tcW w:w="0" w:type="auto"/>
-            <w:vAlign w:val="center"/>
-            <w:hideMark/>
-          </w:tcPr>
-          <w:p>
-            <w:pPr>
-              <w:spacing w:after="0" w:line="240" w:lineRule="auto"/>
-              <w:rPr>
-                <w:rFonts w:ascii="Times New Roman" w:eastAsia="Times New Roman" w:hAnsi="Times New Roman" w:cs="Times New Roman"/>
-                <w:sz w:val="24"/>
-                <w:szCs w:val="24"/>
-              </w:rPr>
-            </w:pPr>
-            <w:proofErr w:type="spellStart"/>
-            <w:r>
-              <w:rPr>
-                <w:rFonts w:ascii="Courier New" w:eastAsia="Times New Roman" w:hAnsi="Courier New" w:cs="Courier New"/>
-                <w:sz w:val="20"/>
-                <w:szCs w:val="20"/>
+            <w:cnfStyle w:val="001000000000" w:firstRow="0" w:lastRow="0" w:firstColumn="1" w:lastColumn="0" w:oddVBand="0" w:evenVBand="0" w:oddHBand="0" w:evenHBand="0" w:firstRowFirstColumn="0" w:firstRowLastColumn="0" w:lastRowFirstColumn="0" w:lastRowLastColumn="0"/>
+            <w:tcW w:w="0" w:type="auto"/>
+            <w:hideMark/>
+          </w:tcPr>
+          <w:p>
+            <w:pPr>
+              <w:rPr>
+                <w:rFonts w:ascii="Times New Roman" w:eastAsia="Times New Roman" w:hAnsi="Times New Roman" w:cs="Times New Roman"/>
+              </w:rPr>
+            </w:pPr>
+            <w:proofErr w:type="spellStart"/>
+            <w:r>
+              <w:rPr>
+                <w:rFonts w:ascii="Times New Roman" w:eastAsia="Times New Roman" w:hAnsi="Times New Roman" w:cs="Times New Roman"/>
               </w:rPr>
               <w:t>git</w:t>
             </w:r>
             <w:proofErr w:type="spellEnd"/>
             <w:r>
               <w:rPr>
-                <w:rFonts w:ascii="Courier New" w:eastAsia="Times New Roman" w:hAnsi="Courier New" w:cs="Courier New"/>
-                <w:sz w:val="20"/>
-                <w:szCs w:val="20"/>
+                <w:rFonts w:ascii="Times New Roman" w:eastAsia="Times New Roman" w:hAnsi="Times New Roman" w:cs="Times New Roman"/>
               </w:rPr>
               <w:t xml:space="preserve"> add</w:t>
             </w:r>
@@ -1611,24 +1311,19 @@
         <w:tc>
           <w:tcPr>
             <w:tcW w:w="0" w:type="auto"/>
-            <w:vAlign w:val="center"/>
-            <w:hideMark/>
-          </w:tcPr>
-          <w:p>
-            <w:pPr>
-              <w:spacing w:after="0" w:line="240" w:lineRule="auto"/>
-              <w:rPr>
-                <w:rFonts w:ascii="Times New Roman" w:eastAsia="Times New Roman" w:hAnsi="Times New Roman" w:cs="Times New Roman"/>
-                <w:sz w:val="24"/>
-                <w:szCs w:val="24"/>
+            <w:hideMark/>
+          </w:tcPr>
+          <w:p>
+            <w:pPr>
+              <w:cnfStyle w:val="000000000000" w:firstRow="0" w:lastRow="0" w:firstColumn="0" w:lastColumn="0" w:oddVBand="0" w:evenVBand="0" w:oddHBand="0" w:evenHBand="0" w:firstRowFirstColumn="0" w:firstRowLastColumn="0" w:lastRowFirstColumn="0" w:lastRowLastColumn="0"/>
+              <w:rPr>
+                <w:rFonts w:ascii="Times New Roman" w:eastAsia="Times New Roman" w:hAnsi="Times New Roman" w:cs="Times New Roman"/>
                 <w:lang w:val="es-ES"/>
               </w:rPr>
             </w:pPr>
             <w:r>
               <w:rPr>
                 <w:rFonts w:ascii="Times New Roman" w:eastAsia="Times New Roman" w:hAnsi="Times New Roman" w:cs="Times New Roman"/>
-                <w:sz w:val="24"/>
-                <w:szCs w:val="24"/>
                 <w:lang w:val="es-ES"/>
               </w:rPr>
               <w:t xml:space="preserve">Preparar cambios para el </w:t>
@@ -1637,8 +1332,6 @@
             <w:r>
               <w:rPr>
                 <w:rFonts w:ascii="Times New Roman" w:eastAsia="Times New Roman" w:hAnsi="Times New Roman" w:cs="Times New Roman"/>
-                <w:sz w:val="24"/>
-                <w:szCs w:val="24"/>
                 <w:lang w:val="es-ES"/>
               </w:rPr>
               <w:t>commit</w:t>
@@ -1649,26 +1342,21 @@
         <w:tc>
           <w:tcPr>
             <w:tcW w:w="0" w:type="auto"/>
-            <w:vAlign w:val="center"/>
-            <w:hideMark/>
-          </w:tcPr>
-          <w:p>
-            <w:pPr>
-              <w:spacing w:after="0" w:line="240" w:lineRule="auto"/>
-              <w:rPr>
-                <w:rFonts w:ascii="Times New Roman" w:eastAsia="Times New Roman" w:hAnsi="Times New Roman" w:cs="Times New Roman"/>
-                <w:sz w:val="24"/>
-                <w:szCs w:val="24"/>
-              </w:rPr>
-            </w:pPr>
-            <w:r>
-              <w:rPr>
-                <w:rFonts w:ascii="Courier New" w:eastAsia="Times New Roman" w:hAnsi="Courier New" w:cs="Courier New"/>
-                <w:sz w:val="20"/>
-                <w:szCs w:val="20"/>
+            <w:hideMark/>
+          </w:tcPr>
+          <w:p>
+            <w:pPr>
+              <w:cnfStyle w:val="000000000000" w:firstRow="0" w:lastRow="0" w:firstColumn="0" w:lastColumn="0" w:oddVBand="0" w:evenVBand="0" w:oddHBand="0" w:evenHBand="0" w:firstRowFirstColumn="0" w:firstRowLastColumn="0" w:lastRowFirstColumn="0" w:lastRowLastColumn="0"/>
+              <w:rPr>
+                <w:rFonts w:ascii="Times New Roman" w:eastAsia="Times New Roman" w:hAnsi="Times New Roman" w:cs="Times New Roman"/>
+              </w:rPr>
+            </w:pPr>
+            <w:r>
+              <w:rPr>
+                <w:rFonts w:ascii="Times New Roman" w:eastAsia="Times New Roman" w:hAnsi="Times New Roman" w:cs="Times New Roman"/>
               </w:rPr>
               <w:drawing>
-                <wp:inline distT="0" distB="0" distL="0" distR="0" wp14:anchorId="265FADEF" wp14:editId="120CE7A3">
+                <wp:inline distT="0" distB="0" distL="0" distR="0" wp14:anchorId="2CE4E3BA" wp14:editId="640127A4">
                   <wp:extent cx="4229898" cy="2032635"/>
                   <wp:effectExtent l="0" t="0" r="0" b="5715"/>
                   <wp:docPr id="3" name="Imagen 3"/>
@@ -1708,39 +1396,32 @@
       </w:tr>
       <w:tr>
         <w:trPr>
+          <w:cnfStyle w:val="000000100000" w:firstRow="0" w:lastRow="0" w:firstColumn="0" w:lastColumn="0" w:oddVBand="0" w:evenVBand="0" w:oddHBand="1" w:evenHBand="0" w:firstRowFirstColumn="0" w:firstRowLastColumn="0" w:lastRowFirstColumn="0" w:lastRowLastColumn="0"/>
           <w:trHeight w:val="4092"/>
-          <w:tblCellSpacing w:w="15" w:type="dxa"/>
         </w:trPr>
         <w:tc>
           <w:tcPr>
-            <w:tcW w:w="0" w:type="auto"/>
-            <w:vAlign w:val="center"/>
-            <w:hideMark/>
-          </w:tcPr>
-          <w:p>
-            <w:pPr>
-              <w:spacing w:after="0" w:line="240" w:lineRule="auto"/>
-              <w:rPr>
-                <w:rFonts w:ascii="Times New Roman" w:eastAsia="Times New Roman" w:hAnsi="Times New Roman" w:cs="Times New Roman"/>
-                <w:sz w:val="24"/>
-                <w:szCs w:val="24"/>
-              </w:rPr>
-            </w:pPr>
-            <w:proofErr w:type="spellStart"/>
-            <w:r>
-              <w:rPr>
-                <w:rFonts w:ascii="Courier New" w:eastAsia="Times New Roman" w:hAnsi="Courier New" w:cs="Courier New"/>
-                <w:sz w:val="20"/>
-                <w:szCs w:val="20"/>
+            <w:cnfStyle w:val="001000000000" w:firstRow="0" w:lastRow="0" w:firstColumn="1" w:lastColumn="0" w:oddVBand="0" w:evenVBand="0" w:oddHBand="0" w:evenHBand="0" w:firstRowFirstColumn="0" w:firstRowLastColumn="0" w:lastRowFirstColumn="0" w:lastRowLastColumn="0"/>
+            <w:tcW w:w="0" w:type="auto"/>
+            <w:hideMark/>
+          </w:tcPr>
+          <w:p>
+            <w:pPr>
+              <w:rPr>
+                <w:rFonts w:ascii="Times New Roman" w:eastAsia="Times New Roman" w:hAnsi="Times New Roman" w:cs="Times New Roman"/>
+              </w:rPr>
+            </w:pPr>
+            <w:proofErr w:type="spellStart"/>
+            <w:r>
+              <w:rPr>
+                <w:rFonts w:ascii="Times New Roman" w:eastAsia="Times New Roman" w:hAnsi="Times New Roman" w:cs="Times New Roman"/>
               </w:rPr>
               <w:t>git</w:t>
             </w:r>
             <w:proofErr w:type="spellEnd"/>
             <w:r>
               <w:rPr>
-                <w:rFonts w:ascii="Courier New" w:eastAsia="Times New Roman" w:hAnsi="Courier New" w:cs="Courier New"/>
-                <w:sz w:val="20"/>
-                <w:szCs w:val="20"/>
+                <w:rFonts w:ascii="Times New Roman" w:eastAsia="Times New Roman" w:hAnsi="Times New Roman" w:cs="Times New Roman"/>
               </w:rPr>
               <w:t xml:space="preserve"> diff</w:t>
             </w:r>
@@ -1749,24 +1430,19 @@
         <w:tc>
           <w:tcPr>
             <w:tcW w:w="0" w:type="auto"/>
-            <w:vAlign w:val="center"/>
-            <w:hideMark/>
-          </w:tcPr>
-          <w:p>
-            <w:pPr>
-              <w:spacing w:after="0" w:line="240" w:lineRule="auto"/>
-              <w:rPr>
-                <w:rFonts w:ascii="Times New Roman" w:eastAsia="Times New Roman" w:hAnsi="Times New Roman" w:cs="Times New Roman"/>
-                <w:sz w:val="24"/>
-                <w:szCs w:val="24"/>
+            <w:hideMark/>
+          </w:tcPr>
+          <w:p>
+            <w:pPr>
+              <w:cnfStyle w:val="000000100000" w:firstRow="0" w:lastRow="0" w:firstColumn="0" w:lastColumn="0" w:oddVBand="0" w:evenVBand="0" w:oddHBand="1" w:evenHBand="0" w:firstRowFirstColumn="0" w:firstRowLastColumn="0" w:lastRowFirstColumn="0" w:lastRowLastColumn="0"/>
+              <w:rPr>
+                <w:rFonts w:ascii="Times New Roman" w:eastAsia="Times New Roman" w:hAnsi="Times New Roman" w:cs="Times New Roman"/>
                 <w:lang w:val="es-ES"/>
               </w:rPr>
             </w:pPr>
             <w:r>
               <w:rPr>
                 <w:rFonts w:ascii="Times New Roman" w:eastAsia="Times New Roman" w:hAnsi="Times New Roman" w:cs="Times New Roman"/>
-                <w:sz w:val="24"/>
-                <w:szCs w:val="24"/>
                 <w:lang w:val="es-ES"/>
               </w:rPr>
               <w:t>Ver cambios aún no preparados</w:t>
@@ -1776,26 +1452,21 @@
         <w:tc>
           <w:tcPr>
             <w:tcW w:w="0" w:type="auto"/>
-            <w:vAlign w:val="center"/>
-            <w:hideMark/>
-          </w:tcPr>
-          <w:p>
-            <w:pPr>
-              <w:spacing w:after="0" w:line="240" w:lineRule="auto"/>
-              <w:rPr>
-                <w:rFonts w:ascii="Times New Roman" w:eastAsia="Times New Roman" w:hAnsi="Times New Roman" w:cs="Times New Roman"/>
-                <w:sz w:val="24"/>
-                <w:szCs w:val="24"/>
-              </w:rPr>
-            </w:pPr>
-            <w:r>
-              <w:rPr>
-                <w:rFonts w:ascii="Courier New" w:eastAsia="Times New Roman" w:hAnsi="Courier New" w:cs="Courier New"/>
-                <w:sz w:val="20"/>
-                <w:szCs w:val="20"/>
+            <w:hideMark/>
+          </w:tcPr>
+          <w:p>
+            <w:pPr>
+              <w:cnfStyle w:val="000000100000" w:firstRow="0" w:lastRow="0" w:firstColumn="0" w:lastColumn="0" w:oddVBand="0" w:evenVBand="0" w:oddHBand="1" w:evenHBand="0" w:firstRowFirstColumn="0" w:firstRowLastColumn="0" w:lastRowFirstColumn="0" w:lastRowLastColumn="0"/>
+              <w:rPr>
+                <w:rFonts w:ascii="Times New Roman" w:eastAsia="Times New Roman" w:hAnsi="Times New Roman" w:cs="Times New Roman"/>
+              </w:rPr>
+            </w:pPr>
+            <w:r>
+              <w:rPr>
+                <w:rFonts w:ascii="Times New Roman" w:eastAsia="Times New Roman" w:hAnsi="Times New Roman" w:cs="Times New Roman"/>
               </w:rPr>
               <w:drawing>
-                <wp:inline distT="0" distB="0" distL="0" distR="0" wp14:anchorId="1622CFF1" wp14:editId="67A7ED02">
+                <wp:inline distT="0" distB="0" distL="0" distR="0" wp14:anchorId="1B5AACF3" wp14:editId="00A9AF1D">
                   <wp:extent cx="4229898" cy="2682240"/>
                   <wp:effectExtent l="0" t="0" r="0" b="3810"/>
                   <wp:docPr id="4" name="Imagen 4"/>
@@ -1836,38 +1507,30 @@
       <w:tr>
         <w:trPr>
           <w:trHeight w:val="1320"/>
-          <w:tblCellSpacing w:w="15" w:type="dxa"/>
         </w:trPr>
         <w:tc>
           <w:tcPr>
-            <w:tcW w:w="0" w:type="auto"/>
-            <w:vAlign w:val="center"/>
-            <w:hideMark/>
-          </w:tcPr>
-          <w:p>
-            <w:pPr>
-              <w:spacing w:after="0" w:line="240" w:lineRule="auto"/>
-              <w:rPr>
-                <w:rFonts w:ascii="Times New Roman" w:eastAsia="Times New Roman" w:hAnsi="Times New Roman" w:cs="Times New Roman"/>
-                <w:sz w:val="24"/>
-                <w:szCs w:val="24"/>
-              </w:rPr>
-            </w:pPr>
-            <w:proofErr w:type="spellStart"/>
-            <w:r>
-              <w:rPr>
-                <w:rFonts w:ascii="Courier New" w:eastAsia="Times New Roman" w:hAnsi="Courier New" w:cs="Courier New"/>
-                <w:sz w:val="20"/>
-                <w:szCs w:val="20"/>
+            <w:cnfStyle w:val="001000000000" w:firstRow="0" w:lastRow="0" w:firstColumn="1" w:lastColumn="0" w:oddVBand="0" w:evenVBand="0" w:oddHBand="0" w:evenHBand="0" w:firstRowFirstColumn="0" w:firstRowLastColumn="0" w:lastRowFirstColumn="0" w:lastRowLastColumn="0"/>
+            <w:tcW w:w="0" w:type="auto"/>
+            <w:hideMark/>
+          </w:tcPr>
+          <w:p>
+            <w:pPr>
+              <w:rPr>
+                <w:rFonts w:ascii="Times New Roman" w:eastAsia="Times New Roman" w:hAnsi="Times New Roman" w:cs="Times New Roman"/>
+              </w:rPr>
+            </w:pPr>
+            <w:proofErr w:type="spellStart"/>
+            <w:r>
+              <w:rPr>
+                <w:rFonts w:ascii="Times New Roman" w:eastAsia="Times New Roman" w:hAnsi="Times New Roman" w:cs="Times New Roman"/>
               </w:rPr>
               <w:t>git</w:t>
             </w:r>
             <w:proofErr w:type="spellEnd"/>
             <w:r>
               <w:rPr>
-                <w:rFonts w:ascii="Courier New" w:eastAsia="Times New Roman" w:hAnsi="Courier New" w:cs="Courier New"/>
-                <w:sz w:val="20"/>
-                <w:szCs w:val="20"/>
+                <w:rFonts w:ascii="Times New Roman" w:eastAsia="Times New Roman" w:hAnsi="Times New Roman" w:cs="Times New Roman"/>
               </w:rPr>
               <w:t xml:space="preserve"> commit -m</w:t>
             </w:r>
@@ -1876,24 +1539,19 @@
         <w:tc>
           <w:tcPr>
             <w:tcW w:w="0" w:type="auto"/>
-            <w:vAlign w:val="center"/>
-            <w:hideMark/>
-          </w:tcPr>
-          <w:p>
-            <w:pPr>
-              <w:spacing w:after="0" w:line="240" w:lineRule="auto"/>
-              <w:rPr>
-                <w:rFonts w:ascii="Times New Roman" w:eastAsia="Times New Roman" w:hAnsi="Times New Roman" w:cs="Times New Roman"/>
-                <w:sz w:val="24"/>
-                <w:szCs w:val="24"/>
+            <w:hideMark/>
+          </w:tcPr>
+          <w:p>
+            <w:pPr>
+              <w:cnfStyle w:val="000000000000" w:firstRow="0" w:lastRow="0" w:firstColumn="0" w:lastColumn="0" w:oddVBand="0" w:evenVBand="0" w:oddHBand="0" w:evenHBand="0" w:firstRowFirstColumn="0" w:firstRowLastColumn="0" w:lastRowFirstColumn="0" w:lastRowLastColumn="0"/>
+              <w:rPr>
+                <w:rFonts w:ascii="Times New Roman" w:eastAsia="Times New Roman" w:hAnsi="Times New Roman" w:cs="Times New Roman"/>
                 <w:lang w:val="es-ES"/>
               </w:rPr>
             </w:pPr>
             <w:r>
               <w:rPr>
                 <w:rFonts w:ascii="Times New Roman" w:eastAsia="Times New Roman" w:hAnsi="Times New Roman" w:cs="Times New Roman"/>
-                <w:sz w:val="24"/>
-                <w:szCs w:val="24"/>
                 <w:lang w:val="es-ES"/>
               </w:rPr>
               <w:t>Confirmar los cambios con un mensaje</w:t>
@@ -1903,26 +1561,21 @@
         <w:tc>
           <w:tcPr>
             <w:tcW w:w="0" w:type="auto"/>
-            <w:vAlign w:val="center"/>
-            <w:hideMark/>
-          </w:tcPr>
-          <w:p>
-            <w:pPr>
-              <w:spacing w:after="0" w:line="240" w:lineRule="auto"/>
-              <w:rPr>
-                <w:rFonts w:ascii="Times New Roman" w:eastAsia="Times New Roman" w:hAnsi="Times New Roman" w:cs="Times New Roman"/>
-                <w:sz w:val="24"/>
-                <w:szCs w:val="24"/>
-              </w:rPr>
-            </w:pPr>
-            <w:r>
-              <w:rPr>
-                <w:rFonts w:ascii="Times New Roman" w:eastAsia="Times New Roman" w:hAnsi="Times New Roman" w:cs="Times New Roman"/>
-                <w:sz w:val="24"/>
-                <w:szCs w:val="24"/>
+            <w:hideMark/>
+          </w:tcPr>
+          <w:p>
+            <w:pPr>
+              <w:cnfStyle w:val="000000000000" w:firstRow="0" w:lastRow="0" w:firstColumn="0" w:lastColumn="0" w:oddVBand="0" w:evenVBand="0" w:oddHBand="0" w:evenHBand="0" w:firstRowFirstColumn="0" w:firstRowLastColumn="0" w:lastRowFirstColumn="0" w:lastRowLastColumn="0"/>
+              <w:rPr>
+                <w:rFonts w:ascii="Times New Roman" w:eastAsia="Times New Roman" w:hAnsi="Times New Roman" w:cs="Times New Roman"/>
+              </w:rPr>
+            </w:pPr>
+            <w:r>
+              <w:rPr>
+                <w:rFonts w:ascii="Times New Roman" w:eastAsia="Times New Roman" w:hAnsi="Times New Roman" w:cs="Times New Roman"/>
               </w:rPr>
               <w:drawing>
-                <wp:inline distT="0" distB="0" distL="0" distR="0" wp14:anchorId="7BE6A0DD" wp14:editId="46BA6424">
+                <wp:inline distT="0" distB="0" distL="0" distR="0" wp14:anchorId="08AF8DEE" wp14:editId="51E4A540">
                   <wp:extent cx="4505954" cy="828791"/>
                   <wp:effectExtent l="0" t="0" r="0" b="9525"/>
                   <wp:docPr id="5" name="Imagen 5"/>
@@ -1962,49 +1615,39 @@
       </w:tr>
       <w:tr>
         <w:trPr>
+          <w:cnfStyle w:val="000000100000" w:firstRow="0" w:lastRow="0" w:firstColumn="0" w:lastColumn="0" w:oddVBand="0" w:evenVBand="0" w:oddHBand="1" w:evenHBand="0" w:firstRowFirstColumn="0" w:firstRowLastColumn="0" w:lastRowFirstColumn="0" w:lastRowLastColumn="0"/>
           <w:trHeight w:val="1078"/>
-          <w:tblCellSpacing w:w="15" w:type="dxa"/>
         </w:trPr>
         <w:tc>
           <w:tcPr>
-            <w:tcW w:w="0" w:type="auto"/>
-            <w:vAlign w:val="center"/>
-            <w:hideMark/>
-          </w:tcPr>
-          <w:p>
-            <w:pPr>
-              <w:spacing w:after="0" w:line="240" w:lineRule="auto"/>
-              <w:rPr>
-                <w:rFonts w:ascii="Times New Roman" w:eastAsia="Times New Roman" w:hAnsi="Times New Roman" w:cs="Times New Roman"/>
-                <w:sz w:val="24"/>
-                <w:szCs w:val="24"/>
-              </w:rPr>
-            </w:pPr>
-            <w:proofErr w:type="spellStart"/>
-            <w:r>
-              <w:rPr>
-                <w:rFonts w:ascii="Courier New" w:eastAsia="Times New Roman" w:hAnsi="Courier New" w:cs="Courier New"/>
-                <w:sz w:val="20"/>
-                <w:szCs w:val="20"/>
-              </w:rPr>
-              <w:lastRenderedPageBreak/>
+            <w:cnfStyle w:val="001000000000" w:firstRow="0" w:lastRow="0" w:firstColumn="1" w:lastColumn="0" w:oddVBand="0" w:evenVBand="0" w:oddHBand="0" w:evenHBand="0" w:firstRowFirstColumn="0" w:firstRowLastColumn="0" w:lastRowFirstColumn="0" w:lastRowLastColumn="0"/>
+            <w:tcW w:w="0" w:type="auto"/>
+            <w:hideMark/>
+          </w:tcPr>
+          <w:p>
+            <w:pPr>
+              <w:rPr>
+                <w:rFonts w:ascii="Times New Roman" w:eastAsia="Times New Roman" w:hAnsi="Times New Roman" w:cs="Times New Roman"/>
+              </w:rPr>
+            </w:pPr>
+            <w:proofErr w:type="spellStart"/>
+            <w:r>
+              <w:rPr>
+                <w:rFonts w:ascii="Times New Roman" w:eastAsia="Times New Roman" w:hAnsi="Times New Roman" w:cs="Times New Roman"/>
+              </w:rPr>
               <w:t>git</w:t>
             </w:r>
             <w:proofErr w:type="spellEnd"/>
             <w:r>
               <w:rPr>
-                <w:rFonts w:ascii="Courier New" w:eastAsia="Times New Roman" w:hAnsi="Courier New" w:cs="Courier New"/>
-                <w:sz w:val="20"/>
-                <w:szCs w:val="20"/>
+                <w:rFonts w:ascii="Times New Roman" w:eastAsia="Times New Roman" w:hAnsi="Times New Roman" w:cs="Times New Roman"/>
               </w:rPr>
               <w:t xml:space="preserve"> </w:t>
             </w:r>
             <w:proofErr w:type="spellStart"/>
             <w:r>
               <w:rPr>
-                <w:rFonts w:ascii="Courier New" w:eastAsia="Times New Roman" w:hAnsi="Courier New" w:cs="Courier New"/>
-                <w:sz w:val="20"/>
-                <w:szCs w:val="20"/>
+                <w:rFonts w:ascii="Times New Roman" w:eastAsia="Times New Roman" w:hAnsi="Times New Roman" w:cs="Times New Roman"/>
               </w:rPr>
               <w:t>rm</w:t>
             </w:r>
@@ -2012,26 +1655,20 @@
             <w:r>
               <w:rPr>
                 <w:rFonts w:ascii="Times New Roman" w:eastAsia="Times New Roman" w:hAnsi="Times New Roman" w:cs="Times New Roman"/>
-                <w:sz w:val="24"/>
-                <w:szCs w:val="24"/>
               </w:rPr>
               <w:t xml:space="preserve"> / </w:t>
             </w:r>
             <w:proofErr w:type="spellStart"/>
             <w:r>
               <w:rPr>
-                <w:rFonts w:ascii="Courier New" w:eastAsia="Times New Roman" w:hAnsi="Courier New" w:cs="Courier New"/>
-                <w:sz w:val="20"/>
-                <w:szCs w:val="20"/>
+                <w:rFonts w:ascii="Times New Roman" w:eastAsia="Times New Roman" w:hAnsi="Times New Roman" w:cs="Times New Roman"/>
               </w:rPr>
               <w:t>git</w:t>
             </w:r>
             <w:proofErr w:type="spellEnd"/>
             <w:r>
               <w:rPr>
-                <w:rFonts w:ascii="Courier New" w:eastAsia="Times New Roman" w:hAnsi="Courier New" w:cs="Courier New"/>
-                <w:sz w:val="20"/>
-                <w:szCs w:val="20"/>
+                <w:rFonts w:ascii="Times New Roman" w:eastAsia="Times New Roman" w:hAnsi="Times New Roman" w:cs="Times New Roman"/>
               </w:rPr>
               <w:t xml:space="preserve"> mv</w:t>
             </w:r>
@@ -2040,24 +1677,19 @@
         <w:tc>
           <w:tcPr>
             <w:tcW w:w="0" w:type="auto"/>
-            <w:vAlign w:val="center"/>
-            <w:hideMark/>
-          </w:tcPr>
-          <w:p>
-            <w:pPr>
-              <w:spacing w:after="0" w:line="240" w:lineRule="auto"/>
-              <w:rPr>
-                <w:rFonts w:ascii="Times New Roman" w:eastAsia="Times New Roman" w:hAnsi="Times New Roman" w:cs="Times New Roman"/>
-                <w:sz w:val="24"/>
-                <w:szCs w:val="24"/>
-              </w:rPr>
-            </w:pPr>
-            <w:proofErr w:type="spellStart"/>
-            <w:r>
-              <w:rPr>
-                <w:rFonts w:ascii="Times New Roman" w:eastAsia="Times New Roman" w:hAnsi="Times New Roman" w:cs="Times New Roman"/>
-                <w:sz w:val="24"/>
-                <w:szCs w:val="24"/>
+            <w:hideMark/>
+          </w:tcPr>
+          <w:p>
+            <w:pPr>
+              <w:cnfStyle w:val="000000100000" w:firstRow="0" w:lastRow="0" w:firstColumn="0" w:lastColumn="0" w:oddVBand="0" w:evenVBand="0" w:oddHBand="1" w:evenHBand="0" w:firstRowFirstColumn="0" w:firstRowLastColumn="0" w:lastRowFirstColumn="0" w:lastRowLastColumn="0"/>
+              <w:rPr>
+                <w:rFonts w:ascii="Times New Roman" w:eastAsia="Times New Roman" w:hAnsi="Times New Roman" w:cs="Times New Roman"/>
+              </w:rPr>
+            </w:pPr>
+            <w:proofErr w:type="spellStart"/>
+            <w:r>
+              <w:rPr>
+                <w:rFonts w:ascii="Times New Roman" w:eastAsia="Times New Roman" w:hAnsi="Times New Roman" w:cs="Times New Roman"/>
               </w:rPr>
               <w:t>Eliminar</w:t>
             </w:r>
@@ -2065,8 +1697,6 @@
             <w:r>
               <w:rPr>
                 <w:rFonts w:ascii="Times New Roman" w:eastAsia="Times New Roman" w:hAnsi="Times New Roman" w:cs="Times New Roman"/>
-                <w:sz w:val="24"/>
-                <w:szCs w:val="24"/>
               </w:rPr>
               <w:t xml:space="preserve"> o </w:t>
             </w:r>
@@ -2074,8 +1704,6 @@
             <w:r>
               <w:rPr>
                 <w:rFonts w:ascii="Times New Roman" w:eastAsia="Times New Roman" w:hAnsi="Times New Roman" w:cs="Times New Roman"/>
-                <w:sz w:val="24"/>
-                <w:szCs w:val="24"/>
               </w:rPr>
               <w:t>renombrar</w:t>
             </w:r>
@@ -2083,8 +1711,6 @@
             <w:r>
               <w:rPr>
                 <w:rFonts w:ascii="Times New Roman" w:eastAsia="Times New Roman" w:hAnsi="Times New Roman" w:cs="Times New Roman"/>
-                <w:sz w:val="24"/>
-                <w:szCs w:val="24"/>
               </w:rPr>
               <w:t xml:space="preserve"> </w:t>
             </w:r>
@@ -2092,8 +1718,6 @@
             <w:r>
               <w:rPr>
                 <w:rFonts w:ascii="Times New Roman" w:eastAsia="Times New Roman" w:hAnsi="Times New Roman" w:cs="Times New Roman"/>
-                <w:sz w:val="24"/>
-                <w:szCs w:val="24"/>
               </w:rPr>
               <w:t>archivos</w:t>
             </w:r>
@@ -2103,33 +1727,26 @@
         <w:tc>
           <w:tcPr>
             <w:tcW w:w="0" w:type="auto"/>
-            <w:vAlign w:val="center"/>
-            <w:hideMark/>
-          </w:tcPr>
-          <w:p>
-            <w:pPr>
-              <w:spacing w:after="0" w:line="240" w:lineRule="auto"/>
-              <w:rPr>
-                <w:rFonts w:ascii="Times New Roman" w:eastAsia="Times New Roman" w:hAnsi="Times New Roman" w:cs="Times New Roman"/>
-                <w:sz w:val="24"/>
-                <w:szCs w:val="24"/>
-              </w:rPr>
-            </w:pPr>
-            <w:proofErr w:type="spellStart"/>
-            <w:r>
-              <w:rPr>
-                <w:rFonts w:ascii="Courier New" w:eastAsia="Times New Roman" w:hAnsi="Courier New" w:cs="Courier New"/>
-                <w:sz w:val="20"/>
-                <w:szCs w:val="20"/>
+            <w:hideMark/>
+          </w:tcPr>
+          <w:p>
+            <w:pPr>
+              <w:cnfStyle w:val="000000100000" w:firstRow="0" w:lastRow="0" w:firstColumn="0" w:lastColumn="0" w:oddVBand="0" w:evenVBand="0" w:oddHBand="1" w:evenHBand="0" w:firstRowFirstColumn="0" w:firstRowLastColumn="0" w:lastRowFirstColumn="0" w:lastRowLastColumn="0"/>
+              <w:rPr>
+                <w:rFonts w:ascii="Times New Roman" w:eastAsia="Times New Roman" w:hAnsi="Times New Roman" w:cs="Times New Roman"/>
+              </w:rPr>
+            </w:pPr>
+            <w:proofErr w:type="spellStart"/>
+            <w:r>
+              <w:rPr>
+                <w:rFonts w:ascii="Times New Roman" w:eastAsia="Times New Roman" w:hAnsi="Times New Roman" w:cs="Times New Roman"/>
               </w:rPr>
               <w:t>git</w:t>
             </w:r>
             <w:proofErr w:type="spellEnd"/>
             <w:r>
               <w:rPr>
-                <w:rFonts w:ascii="Courier New" w:eastAsia="Times New Roman" w:hAnsi="Courier New" w:cs="Courier New"/>
-                <w:sz w:val="20"/>
-                <w:szCs w:val="20"/>
+                <w:rFonts w:ascii="Times New Roman" w:eastAsia="Times New Roman" w:hAnsi="Times New Roman" w:cs="Times New Roman"/>
               </w:rPr>
               <w:t xml:space="preserve"> mv a.txt b.txt</w:t>
             </w:r>
@@ -2139,47 +1756,38 @@
       <w:tr>
         <w:trPr>
           <w:trHeight w:val="885"/>
-          <w:tblCellSpacing w:w="15" w:type="dxa"/>
         </w:trPr>
         <w:tc>
           <w:tcPr>
-            <w:tcW w:w="0" w:type="auto"/>
-            <w:vAlign w:val="center"/>
-            <w:hideMark/>
-          </w:tcPr>
-          <w:p>
-            <w:pPr>
-              <w:spacing w:after="0" w:line="240" w:lineRule="auto"/>
-              <w:rPr>
-                <w:rFonts w:ascii="Times New Roman" w:eastAsia="Times New Roman" w:hAnsi="Times New Roman" w:cs="Times New Roman"/>
-                <w:sz w:val="24"/>
-                <w:szCs w:val="24"/>
-              </w:rPr>
-            </w:pPr>
-            <w:proofErr w:type="spellStart"/>
-            <w:r>
-              <w:rPr>
-                <w:rFonts w:ascii="Courier New" w:eastAsia="Times New Roman" w:hAnsi="Courier New" w:cs="Courier New"/>
-                <w:sz w:val="20"/>
-                <w:szCs w:val="20"/>
-              </w:rPr>
+            <w:cnfStyle w:val="001000000000" w:firstRow="0" w:lastRow="0" w:firstColumn="1" w:lastColumn="0" w:oddVBand="0" w:evenVBand="0" w:oddHBand="0" w:evenHBand="0" w:firstRowFirstColumn="0" w:firstRowLastColumn="0" w:lastRowFirstColumn="0" w:lastRowLastColumn="0"/>
+            <w:tcW w:w="0" w:type="auto"/>
+            <w:hideMark/>
+          </w:tcPr>
+          <w:p>
+            <w:pPr>
+              <w:rPr>
+                <w:rFonts w:ascii="Times New Roman" w:eastAsia="Times New Roman" w:hAnsi="Times New Roman" w:cs="Times New Roman"/>
+              </w:rPr>
+            </w:pPr>
+            <w:proofErr w:type="spellStart"/>
+            <w:r>
+              <w:rPr>
+                <w:rFonts w:ascii="Times New Roman" w:eastAsia="Times New Roman" w:hAnsi="Times New Roman" w:cs="Times New Roman"/>
+              </w:rPr>
+              <w:lastRenderedPageBreak/>
               <w:t>git</w:t>
             </w:r>
             <w:proofErr w:type="spellEnd"/>
             <w:r>
               <w:rPr>
-                <w:rFonts w:ascii="Courier New" w:eastAsia="Times New Roman" w:hAnsi="Courier New" w:cs="Courier New"/>
-                <w:sz w:val="20"/>
-                <w:szCs w:val="20"/>
+                <w:rFonts w:ascii="Times New Roman" w:eastAsia="Times New Roman" w:hAnsi="Times New Roman" w:cs="Times New Roman"/>
               </w:rPr>
               <w:t xml:space="preserve"> log --</w:t>
             </w:r>
             <w:proofErr w:type="spellStart"/>
             <w:r>
               <w:rPr>
-                <w:rFonts w:ascii="Courier New" w:eastAsia="Times New Roman" w:hAnsi="Courier New" w:cs="Courier New"/>
-                <w:sz w:val="20"/>
-                <w:szCs w:val="20"/>
+                <w:rFonts w:ascii="Times New Roman" w:eastAsia="Times New Roman" w:hAnsi="Times New Roman" w:cs="Times New Roman"/>
               </w:rPr>
               <w:t>oneline</w:t>
             </w:r>
@@ -2189,24 +1797,19 @@
         <w:tc>
           <w:tcPr>
             <w:tcW w:w="0" w:type="auto"/>
-            <w:vAlign w:val="center"/>
-            <w:hideMark/>
-          </w:tcPr>
-          <w:p>
-            <w:pPr>
-              <w:spacing w:after="0" w:line="240" w:lineRule="auto"/>
-              <w:rPr>
-                <w:rFonts w:ascii="Times New Roman" w:eastAsia="Times New Roman" w:hAnsi="Times New Roman" w:cs="Times New Roman"/>
-                <w:sz w:val="24"/>
-                <w:szCs w:val="24"/>
-              </w:rPr>
-            </w:pPr>
-            <w:proofErr w:type="spellStart"/>
-            <w:r>
-              <w:rPr>
-                <w:rFonts w:ascii="Times New Roman" w:eastAsia="Times New Roman" w:hAnsi="Times New Roman" w:cs="Times New Roman"/>
-                <w:sz w:val="24"/>
-                <w:szCs w:val="24"/>
+            <w:hideMark/>
+          </w:tcPr>
+          <w:p>
+            <w:pPr>
+              <w:cnfStyle w:val="000000000000" w:firstRow="0" w:lastRow="0" w:firstColumn="0" w:lastColumn="0" w:oddVBand="0" w:evenVBand="0" w:oddHBand="0" w:evenHBand="0" w:firstRowFirstColumn="0" w:firstRowLastColumn="0" w:lastRowFirstColumn="0" w:lastRowLastColumn="0"/>
+              <w:rPr>
+                <w:rFonts w:ascii="Times New Roman" w:eastAsia="Times New Roman" w:hAnsi="Times New Roman" w:cs="Times New Roman"/>
+              </w:rPr>
+            </w:pPr>
+            <w:proofErr w:type="spellStart"/>
+            <w:r>
+              <w:rPr>
+                <w:rFonts w:ascii="Times New Roman" w:eastAsia="Times New Roman" w:hAnsi="Times New Roman" w:cs="Times New Roman"/>
               </w:rPr>
               <w:t>Ver</w:t>
             </w:r>
@@ -2214,8 +1817,6 @@
             <w:r>
               <w:rPr>
                 <w:rFonts w:ascii="Times New Roman" w:eastAsia="Times New Roman" w:hAnsi="Times New Roman" w:cs="Times New Roman"/>
-                <w:sz w:val="24"/>
-                <w:szCs w:val="24"/>
               </w:rPr>
               <w:t xml:space="preserve"> el </w:t>
             </w:r>
@@ -2223,8 +1824,6 @@
             <w:r>
               <w:rPr>
                 <w:rFonts w:ascii="Times New Roman" w:eastAsia="Times New Roman" w:hAnsi="Times New Roman" w:cs="Times New Roman"/>
-                <w:sz w:val="24"/>
-                <w:szCs w:val="24"/>
               </w:rPr>
               <w:t>historial</w:t>
             </w:r>
@@ -2232,8 +1831,6 @@
             <w:r>
               <w:rPr>
                 <w:rFonts w:ascii="Times New Roman" w:eastAsia="Times New Roman" w:hAnsi="Times New Roman" w:cs="Times New Roman"/>
-                <w:sz w:val="24"/>
-                <w:szCs w:val="24"/>
               </w:rPr>
               <w:t xml:space="preserve"> </w:t>
             </w:r>
@@ -2241,8 +1838,6 @@
             <w:r>
               <w:rPr>
                 <w:rFonts w:ascii="Times New Roman" w:eastAsia="Times New Roman" w:hAnsi="Times New Roman" w:cs="Times New Roman"/>
-                <w:sz w:val="24"/>
-                <w:szCs w:val="24"/>
               </w:rPr>
               <w:t>resumido</w:t>
             </w:r>
@@ -2252,42 +1847,33 @@
         <w:tc>
           <w:tcPr>
             <w:tcW w:w="0" w:type="auto"/>
-            <w:vAlign w:val="center"/>
-            <w:hideMark/>
-          </w:tcPr>
-          <w:p>
-            <w:pPr>
-              <w:spacing w:after="0" w:line="240" w:lineRule="auto"/>
-              <w:rPr>
-                <w:rFonts w:ascii="Times New Roman" w:eastAsia="Times New Roman" w:hAnsi="Times New Roman" w:cs="Times New Roman"/>
-                <w:sz w:val="24"/>
-                <w:szCs w:val="24"/>
-              </w:rPr>
-            </w:pPr>
-            <w:proofErr w:type="spellStart"/>
-            <w:r>
-              <w:rPr>
-                <w:rFonts w:ascii="Courier New" w:eastAsia="Times New Roman" w:hAnsi="Courier New" w:cs="Courier New"/>
-                <w:sz w:val="20"/>
-                <w:szCs w:val="20"/>
+            <w:hideMark/>
+          </w:tcPr>
+          <w:p>
+            <w:pPr>
+              <w:cnfStyle w:val="000000000000" w:firstRow="0" w:lastRow="0" w:firstColumn="0" w:lastColumn="0" w:oddVBand="0" w:evenVBand="0" w:oddHBand="0" w:evenHBand="0" w:firstRowFirstColumn="0" w:firstRowLastColumn="0" w:lastRowFirstColumn="0" w:lastRowLastColumn="0"/>
+              <w:rPr>
+                <w:rFonts w:ascii="Times New Roman" w:eastAsia="Times New Roman" w:hAnsi="Times New Roman" w:cs="Times New Roman"/>
+              </w:rPr>
+            </w:pPr>
+            <w:proofErr w:type="spellStart"/>
+            <w:r>
+              <w:rPr>
+                <w:rFonts w:ascii="Times New Roman" w:eastAsia="Times New Roman" w:hAnsi="Times New Roman" w:cs="Times New Roman"/>
               </w:rPr>
               <w:t>git</w:t>
             </w:r>
             <w:proofErr w:type="spellEnd"/>
             <w:r>
               <w:rPr>
-                <w:rFonts w:ascii="Courier New" w:eastAsia="Times New Roman" w:hAnsi="Courier New" w:cs="Courier New"/>
-                <w:sz w:val="20"/>
-                <w:szCs w:val="20"/>
+                <w:rFonts w:ascii="Times New Roman" w:eastAsia="Times New Roman" w:hAnsi="Times New Roman" w:cs="Times New Roman"/>
               </w:rPr>
               <w:t xml:space="preserve"> log --</w:t>
             </w:r>
             <w:proofErr w:type="spellStart"/>
             <w:r>
               <w:rPr>
-                <w:rFonts w:ascii="Courier New" w:eastAsia="Times New Roman" w:hAnsi="Courier New" w:cs="Courier New"/>
-                <w:sz w:val="20"/>
-                <w:szCs w:val="20"/>
+                <w:rFonts w:ascii="Times New Roman" w:eastAsia="Times New Roman" w:hAnsi="Times New Roman" w:cs="Times New Roman"/>
               </w:rPr>
               <w:t>oneline</w:t>
             </w:r>
@@ -2297,39 +1883,32 @@
       </w:tr>
       <w:tr>
         <w:trPr>
+          <w:cnfStyle w:val="000000100000" w:firstRow="0" w:lastRow="0" w:firstColumn="0" w:lastColumn="0" w:oddVBand="0" w:evenVBand="0" w:oddHBand="1" w:evenHBand="0" w:firstRowFirstColumn="0" w:firstRowLastColumn="0" w:lastRowFirstColumn="0" w:lastRowLastColumn="0"/>
           <w:trHeight w:val="981"/>
-          <w:tblCellSpacing w:w="15" w:type="dxa"/>
         </w:trPr>
         <w:tc>
           <w:tcPr>
-            <w:tcW w:w="0" w:type="auto"/>
-            <w:vAlign w:val="center"/>
-            <w:hideMark/>
-          </w:tcPr>
-          <w:p>
-            <w:pPr>
-              <w:spacing w:after="0" w:line="240" w:lineRule="auto"/>
-              <w:rPr>
-                <w:rFonts w:ascii="Times New Roman" w:eastAsia="Times New Roman" w:hAnsi="Times New Roman" w:cs="Times New Roman"/>
-                <w:sz w:val="24"/>
-                <w:szCs w:val="24"/>
-              </w:rPr>
-            </w:pPr>
-            <w:proofErr w:type="spellStart"/>
-            <w:r>
-              <w:rPr>
-                <w:rFonts w:ascii="Courier New" w:eastAsia="Times New Roman" w:hAnsi="Courier New" w:cs="Courier New"/>
-                <w:sz w:val="20"/>
-                <w:szCs w:val="20"/>
+            <w:cnfStyle w:val="001000000000" w:firstRow="0" w:lastRow="0" w:firstColumn="1" w:lastColumn="0" w:oddVBand="0" w:evenVBand="0" w:oddHBand="0" w:evenHBand="0" w:firstRowFirstColumn="0" w:firstRowLastColumn="0" w:lastRowFirstColumn="0" w:lastRowLastColumn="0"/>
+            <w:tcW w:w="0" w:type="auto"/>
+            <w:hideMark/>
+          </w:tcPr>
+          <w:p>
+            <w:pPr>
+              <w:rPr>
+                <w:rFonts w:ascii="Times New Roman" w:eastAsia="Times New Roman" w:hAnsi="Times New Roman" w:cs="Times New Roman"/>
+              </w:rPr>
+            </w:pPr>
+            <w:proofErr w:type="spellStart"/>
+            <w:r>
+              <w:rPr>
+                <w:rFonts w:ascii="Times New Roman" w:eastAsia="Times New Roman" w:hAnsi="Times New Roman" w:cs="Times New Roman"/>
               </w:rPr>
               <w:t>git</w:t>
             </w:r>
             <w:proofErr w:type="spellEnd"/>
             <w:r>
               <w:rPr>
-                <w:rFonts w:ascii="Courier New" w:eastAsia="Times New Roman" w:hAnsi="Courier New" w:cs="Courier New"/>
-                <w:sz w:val="20"/>
-                <w:szCs w:val="20"/>
+                <w:rFonts w:ascii="Times New Roman" w:eastAsia="Times New Roman" w:hAnsi="Times New Roman" w:cs="Times New Roman"/>
               </w:rPr>
               <w:t xml:space="preserve"> commit --amend</w:t>
             </w:r>
@@ -2338,24 +1917,19 @@
         <w:tc>
           <w:tcPr>
             <w:tcW w:w="0" w:type="auto"/>
-            <w:vAlign w:val="center"/>
-            <w:hideMark/>
-          </w:tcPr>
-          <w:p>
-            <w:pPr>
-              <w:spacing w:after="0" w:line="240" w:lineRule="auto"/>
-              <w:rPr>
-                <w:rFonts w:ascii="Times New Roman" w:eastAsia="Times New Roman" w:hAnsi="Times New Roman" w:cs="Times New Roman"/>
-                <w:sz w:val="24"/>
-                <w:szCs w:val="24"/>
-              </w:rPr>
-            </w:pPr>
-            <w:proofErr w:type="spellStart"/>
-            <w:r>
-              <w:rPr>
-                <w:rFonts w:ascii="Times New Roman" w:eastAsia="Times New Roman" w:hAnsi="Times New Roman" w:cs="Times New Roman"/>
-                <w:sz w:val="24"/>
-                <w:szCs w:val="24"/>
+            <w:hideMark/>
+          </w:tcPr>
+          <w:p>
+            <w:pPr>
+              <w:cnfStyle w:val="000000100000" w:firstRow="0" w:lastRow="0" w:firstColumn="0" w:lastColumn="0" w:oddVBand="0" w:evenVBand="0" w:oddHBand="1" w:evenHBand="0" w:firstRowFirstColumn="0" w:firstRowLastColumn="0" w:lastRowFirstColumn="0" w:lastRowLastColumn="0"/>
+              <w:rPr>
+                <w:rFonts w:ascii="Times New Roman" w:eastAsia="Times New Roman" w:hAnsi="Times New Roman" w:cs="Times New Roman"/>
+              </w:rPr>
+            </w:pPr>
+            <w:proofErr w:type="spellStart"/>
+            <w:r>
+              <w:rPr>
+                <w:rFonts w:ascii="Times New Roman" w:eastAsia="Times New Roman" w:hAnsi="Times New Roman" w:cs="Times New Roman"/>
               </w:rPr>
               <w:t>Corregir</w:t>
             </w:r>
@@ -2363,8 +1937,6 @@
             <w:r>
               <w:rPr>
                 <w:rFonts w:ascii="Times New Roman" w:eastAsia="Times New Roman" w:hAnsi="Times New Roman" w:cs="Times New Roman"/>
-                <w:sz w:val="24"/>
-                <w:szCs w:val="24"/>
               </w:rPr>
               <w:t xml:space="preserve"> el </w:t>
             </w:r>
@@ -2372,8 +1944,6 @@
             <w:r>
               <w:rPr>
                 <w:rFonts w:ascii="Times New Roman" w:eastAsia="Times New Roman" w:hAnsi="Times New Roman" w:cs="Times New Roman"/>
-                <w:sz w:val="24"/>
-                <w:szCs w:val="24"/>
               </w:rPr>
               <w:t>último</w:t>
             </w:r>
@@ -2381,8 +1951,6 @@
             <w:r>
               <w:rPr>
                 <w:rFonts w:ascii="Times New Roman" w:eastAsia="Times New Roman" w:hAnsi="Times New Roman" w:cs="Times New Roman"/>
-                <w:sz w:val="24"/>
-                <w:szCs w:val="24"/>
               </w:rPr>
               <w:t xml:space="preserve"> commit</w:t>
             </w:r>
@@ -2391,26 +1959,21 @@
         <w:tc>
           <w:tcPr>
             <w:tcW w:w="0" w:type="auto"/>
-            <w:vAlign w:val="center"/>
-            <w:hideMark/>
-          </w:tcPr>
-          <w:p>
-            <w:pPr>
-              <w:spacing w:after="0" w:line="240" w:lineRule="auto"/>
-              <w:rPr>
-                <w:rFonts w:ascii="Times New Roman" w:eastAsia="Times New Roman" w:hAnsi="Times New Roman" w:cs="Times New Roman"/>
-                <w:sz w:val="24"/>
-                <w:szCs w:val="24"/>
-              </w:rPr>
-            </w:pPr>
-            <w:r>
-              <w:rPr>
-                <w:rFonts w:ascii="Courier New" w:eastAsia="Times New Roman" w:hAnsi="Courier New" w:cs="Courier New"/>
-                <w:sz w:val="20"/>
-                <w:szCs w:val="20"/>
+            <w:hideMark/>
+          </w:tcPr>
+          <w:p>
+            <w:pPr>
+              <w:cnfStyle w:val="000000100000" w:firstRow="0" w:lastRow="0" w:firstColumn="0" w:lastColumn="0" w:oddVBand="0" w:evenVBand="0" w:oddHBand="1" w:evenHBand="0" w:firstRowFirstColumn="0" w:firstRowLastColumn="0" w:lastRowFirstColumn="0" w:lastRowLastColumn="0"/>
+              <w:rPr>
+                <w:rFonts w:ascii="Times New Roman" w:eastAsia="Times New Roman" w:hAnsi="Times New Roman" w:cs="Times New Roman"/>
+              </w:rPr>
+            </w:pPr>
+            <w:r>
+              <w:rPr>
+                <w:rFonts w:ascii="Times New Roman" w:eastAsia="Times New Roman" w:hAnsi="Times New Roman" w:cs="Times New Roman"/>
               </w:rPr>
               <w:drawing>
-                <wp:inline distT="0" distB="0" distL="0" distR="0" wp14:anchorId="0E07F7D5" wp14:editId="31FCEFAE">
+                <wp:inline distT="0" distB="0" distL="0" distR="0" wp14:anchorId="4BA459A9" wp14:editId="7B107C9C">
                   <wp:extent cx="4240530" cy="644525"/>
                   <wp:effectExtent l="0" t="0" r="7620" b="3175"/>
                   <wp:docPr id="6" name="Imagen 6"/>
@@ -2451,38 +2014,30 @@
       <w:tr>
         <w:trPr>
           <w:trHeight w:val="1337"/>
-          <w:tblCellSpacing w:w="15" w:type="dxa"/>
         </w:trPr>
         <w:tc>
           <w:tcPr>
-            <w:tcW w:w="0" w:type="auto"/>
-            <w:vAlign w:val="center"/>
-            <w:hideMark/>
-          </w:tcPr>
-          <w:p>
-            <w:pPr>
-              <w:spacing w:after="0" w:line="240" w:lineRule="auto"/>
-              <w:rPr>
-                <w:rFonts w:ascii="Times New Roman" w:eastAsia="Times New Roman" w:hAnsi="Times New Roman" w:cs="Times New Roman"/>
-                <w:sz w:val="24"/>
-                <w:szCs w:val="24"/>
-              </w:rPr>
-            </w:pPr>
-            <w:proofErr w:type="spellStart"/>
-            <w:r>
-              <w:rPr>
-                <w:rFonts w:ascii="Courier New" w:eastAsia="Times New Roman" w:hAnsi="Courier New" w:cs="Courier New"/>
-                <w:sz w:val="20"/>
-                <w:szCs w:val="20"/>
+            <w:cnfStyle w:val="001000000000" w:firstRow="0" w:lastRow="0" w:firstColumn="1" w:lastColumn="0" w:oddVBand="0" w:evenVBand="0" w:oddHBand="0" w:evenHBand="0" w:firstRowFirstColumn="0" w:firstRowLastColumn="0" w:lastRowFirstColumn="0" w:lastRowLastColumn="0"/>
+            <w:tcW w:w="0" w:type="auto"/>
+            <w:hideMark/>
+          </w:tcPr>
+          <w:p>
+            <w:pPr>
+              <w:rPr>
+                <w:rFonts w:ascii="Times New Roman" w:eastAsia="Times New Roman" w:hAnsi="Times New Roman" w:cs="Times New Roman"/>
+              </w:rPr>
+            </w:pPr>
+            <w:proofErr w:type="spellStart"/>
+            <w:r>
+              <w:rPr>
+                <w:rFonts w:ascii="Times New Roman" w:eastAsia="Times New Roman" w:hAnsi="Times New Roman" w:cs="Times New Roman"/>
               </w:rPr>
               <w:t>git</w:t>
             </w:r>
             <w:proofErr w:type="spellEnd"/>
             <w:r>
               <w:rPr>
-                <w:rFonts w:ascii="Courier New" w:eastAsia="Times New Roman" w:hAnsi="Courier New" w:cs="Courier New"/>
-                <w:sz w:val="20"/>
-                <w:szCs w:val="20"/>
+                <w:rFonts w:ascii="Times New Roman" w:eastAsia="Times New Roman" w:hAnsi="Times New Roman" w:cs="Times New Roman"/>
               </w:rPr>
               <w:t xml:space="preserve"> restore</w:t>
             </w:r>
@@ -2491,24 +2046,19 @@
         <w:tc>
           <w:tcPr>
             <w:tcW w:w="0" w:type="auto"/>
-            <w:vAlign w:val="center"/>
-            <w:hideMark/>
-          </w:tcPr>
-          <w:p>
-            <w:pPr>
-              <w:spacing w:after="0" w:line="240" w:lineRule="auto"/>
-              <w:rPr>
-                <w:rFonts w:ascii="Times New Roman" w:eastAsia="Times New Roman" w:hAnsi="Times New Roman" w:cs="Times New Roman"/>
-                <w:sz w:val="24"/>
-                <w:szCs w:val="24"/>
+            <w:hideMark/>
+          </w:tcPr>
+          <w:p>
+            <w:pPr>
+              <w:cnfStyle w:val="000000000000" w:firstRow="0" w:lastRow="0" w:firstColumn="0" w:lastColumn="0" w:oddVBand="0" w:evenVBand="0" w:oddHBand="0" w:evenHBand="0" w:firstRowFirstColumn="0" w:firstRowLastColumn="0" w:lastRowFirstColumn="0" w:lastRowLastColumn="0"/>
+              <w:rPr>
+                <w:rFonts w:ascii="Times New Roman" w:eastAsia="Times New Roman" w:hAnsi="Times New Roman" w:cs="Times New Roman"/>
                 <w:lang w:val="es-ES"/>
               </w:rPr>
             </w:pPr>
             <w:r>
               <w:rPr>
                 <w:rFonts w:ascii="Times New Roman" w:eastAsia="Times New Roman" w:hAnsi="Times New Roman" w:cs="Times New Roman"/>
-                <w:sz w:val="24"/>
-                <w:szCs w:val="24"/>
                 <w:lang w:val="es-ES"/>
               </w:rPr>
               <w:t xml:space="preserve">Descartar cambios o sacar del </w:t>
@@ -2517,8 +2067,6 @@
             <w:r>
               <w:rPr>
                 <w:rFonts w:ascii="Times New Roman" w:eastAsia="Times New Roman" w:hAnsi="Times New Roman" w:cs="Times New Roman"/>
-                <w:sz w:val="24"/>
-                <w:szCs w:val="24"/>
                 <w:lang w:val="es-ES"/>
               </w:rPr>
               <w:t>staging</w:t>
@@ -2529,33 +2077,26 @@
         <w:tc>
           <w:tcPr>
             <w:tcW w:w="0" w:type="auto"/>
-            <w:vAlign w:val="center"/>
-            <w:hideMark/>
-          </w:tcPr>
-          <w:p>
-            <w:pPr>
-              <w:spacing w:after="0" w:line="240" w:lineRule="auto"/>
-              <w:rPr>
-                <w:rFonts w:ascii="Times New Roman" w:eastAsia="Times New Roman" w:hAnsi="Times New Roman" w:cs="Times New Roman"/>
-                <w:sz w:val="24"/>
-                <w:szCs w:val="24"/>
-              </w:rPr>
-            </w:pPr>
-            <w:proofErr w:type="spellStart"/>
-            <w:r>
-              <w:rPr>
-                <w:rFonts w:ascii="Courier New" w:eastAsia="Times New Roman" w:hAnsi="Courier New" w:cs="Courier New"/>
-                <w:sz w:val="20"/>
-                <w:szCs w:val="20"/>
+            <w:hideMark/>
+          </w:tcPr>
+          <w:p>
+            <w:pPr>
+              <w:cnfStyle w:val="000000000000" w:firstRow="0" w:lastRow="0" w:firstColumn="0" w:lastColumn="0" w:oddVBand="0" w:evenVBand="0" w:oddHBand="0" w:evenHBand="0" w:firstRowFirstColumn="0" w:firstRowLastColumn="0" w:lastRowFirstColumn="0" w:lastRowLastColumn="0"/>
+              <w:rPr>
+                <w:rFonts w:ascii="Times New Roman" w:eastAsia="Times New Roman" w:hAnsi="Times New Roman" w:cs="Times New Roman"/>
+              </w:rPr>
+            </w:pPr>
+            <w:proofErr w:type="spellStart"/>
+            <w:r>
+              <w:rPr>
+                <w:rFonts w:ascii="Times New Roman" w:eastAsia="Times New Roman" w:hAnsi="Times New Roman" w:cs="Times New Roman"/>
               </w:rPr>
               <w:t>git</w:t>
             </w:r>
             <w:proofErr w:type="spellEnd"/>
             <w:r>
               <w:rPr>
-                <w:rFonts w:ascii="Courier New" w:eastAsia="Times New Roman" w:hAnsi="Courier New" w:cs="Courier New"/>
-                <w:sz w:val="20"/>
-                <w:szCs w:val="20"/>
+                <w:rFonts w:ascii="Times New Roman" w:eastAsia="Times New Roman" w:hAnsi="Times New Roman" w:cs="Times New Roman"/>
               </w:rPr>
               <w:t xml:space="preserve"> restore --staged notas.txt</w:t>
             </w:r>
@@ -2564,39 +2105,32 @@
       </w:tr>
       <w:tr>
         <w:trPr>
+          <w:cnfStyle w:val="000000100000" w:firstRow="0" w:lastRow="0" w:firstColumn="0" w:lastColumn="0" w:oddVBand="0" w:evenVBand="0" w:oddHBand="1" w:evenHBand="0" w:firstRowFirstColumn="0" w:firstRowLastColumn="0" w:lastRowFirstColumn="0" w:lastRowLastColumn="0"/>
           <w:trHeight w:val="3867"/>
-          <w:tblCellSpacing w:w="15" w:type="dxa"/>
         </w:trPr>
         <w:tc>
           <w:tcPr>
-            <w:tcW w:w="0" w:type="auto"/>
-            <w:vAlign w:val="center"/>
-            <w:hideMark/>
-          </w:tcPr>
-          <w:p>
-            <w:pPr>
-              <w:spacing w:after="0" w:line="240" w:lineRule="auto"/>
-              <w:rPr>
-                <w:rFonts w:ascii="Times New Roman" w:eastAsia="Times New Roman" w:hAnsi="Times New Roman" w:cs="Times New Roman"/>
-                <w:sz w:val="24"/>
-                <w:szCs w:val="24"/>
-              </w:rPr>
-            </w:pPr>
-            <w:proofErr w:type="spellStart"/>
-            <w:r>
-              <w:rPr>
-                <w:rFonts w:ascii="Courier New" w:eastAsia="Times New Roman" w:hAnsi="Courier New" w:cs="Courier New"/>
-                <w:sz w:val="20"/>
-                <w:szCs w:val="20"/>
+            <w:cnfStyle w:val="001000000000" w:firstRow="0" w:lastRow="0" w:firstColumn="1" w:lastColumn="0" w:oddVBand="0" w:evenVBand="0" w:oddHBand="0" w:evenHBand="0" w:firstRowFirstColumn="0" w:firstRowLastColumn="0" w:lastRowFirstColumn="0" w:lastRowLastColumn="0"/>
+            <w:tcW w:w="0" w:type="auto"/>
+            <w:hideMark/>
+          </w:tcPr>
+          <w:p>
+            <w:pPr>
+              <w:rPr>
+                <w:rFonts w:ascii="Times New Roman" w:eastAsia="Times New Roman" w:hAnsi="Times New Roman" w:cs="Times New Roman"/>
+              </w:rPr>
+            </w:pPr>
+            <w:proofErr w:type="spellStart"/>
+            <w:r>
+              <w:rPr>
+                <w:rFonts w:ascii="Times New Roman" w:eastAsia="Times New Roman" w:hAnsi="Times New Roman" w:cs="Times New Roman"/>
               </w:rPr>
               <w:t>git</w:t>
             </w:r>
             <w:proofErr w:type="spellEnd"/>
             <w:r>
               <w:rPr>
-                <w:rFonts w:ascii="Courier New" w:eastAsia="Times New Roman" w:hAnsi="Courier New" w:cs="Courier New"/>
-                <w:sz w:val="20"/>
-                <w:szCs w:val="20"/>
+                <w:rFonts w:ascii="Times New Roman" w:eastAsia="Times New Roman" w:hAnsi="Times New Roman" w:cs="Times New Roman"/>
               </w:rPr>
               <w:t xml:space="preserve"> remote -v</w:t>
             </w:r>
@@ -2605,24 +2139,19 @@
         <w:tc>
           <w:tcPr>
             <w:tcW w:w="0" w:type="auto"/>
-            <w:vAlign w:val="center"/>
-            <w:hideMark/>
-          </w:tcPr>
-          <w:p>
-            <w:pPr>
-              <w:spacing w:after="0" w:line="240" w:lineRule="auto"/>
-              <w:rPr>
-                <w:rFonts w:ascii="Times New Roman" w:eastAsia="Times New Roman" w:hAnsi="Times New Roman" w:cs="Times New Roman"/>
-                <w:sz w:val="24"/>
-                <w:szCs w:val="24"/>
-              </w:rPr>
-            </w:pPr>
-            <w:proofErr w:type="spellStart"/>
-            <w:r>
-              <w:rPr>
-                <w:rFonts w:ascii="Times New Roman" w:eastAsia="Times New Roman" w:hAnsi="Times New Roman" w:cs="Times New Roman"/>
-                <w:sz w:val="24"/>
-                <w:szCs w:val="24"/>
+            <w:hideMark/>
+          </w:tcPr>
+          <w:p>
+            <w:pPr>
+              <w:cnfStyle w:val="000000100000" w:firstRow="0" w:lastRow="0" w:firstColumn="0" w:lastColumn="0" w:oddVBand="0" w:evenVBand="0" w:oddHBand="1" w:evenHBand="0" w:firstRowFirstColumn="0" w:firstRowLastColumn="0" w:lastRowFirstColumn="0" w:lastRowLastColumn="0"/>
+              <w:rPr>
+                <w:rFonts w:ascii="Times New Roman" w:eastAsia="Times New Roman" w:hAnsi="Times New Roman" w:cs="Times New Roman"/>
+              </w:rPr>
+            </w:pPr>
+            <w:proofErr w:type="spellStart"/>
+            <w:r>
+              <w:rPr>
+                <w:rFonts w:ascii="Times New Roman" w:eastAsia="Times New Roman" w:hAnsi="Times New Roman" w:cs="Times New Roman"/>
               </w:rPr>
               <w:t>Ver</w:t>
             </w:r>
@@ -2630,8 +2159,6 @@
             <w:r>
               <w:rPr>
                 <w:rFonts w:ascii="Times New Roman" w:eastAsia="Times New Roman" w:hAnsi="Times New Roman" w:cs="Times New Roman"/>
-                <w:sz w:val="24"/>
-                <w:szCs w:val="24"/>
               </w:rPr>
               <w:t xml:space="preserve"> </w:t>
             </w:r>
@@ -2639,8 +2166,6 @@
             <w:r>
               <w:rPr>
                 <w:rFonts w:ascii="Times New Roman" w:eastAsia="Times New Roman" w:hAnsi="Times New Roman" w:cs="Times New Roman"/>
-                <w:sz w:val="24"/>
-                <w:szCs w:val="24"/>
               </w:rPr>
               <w:t>los</w:t>
             </w:r>
@@ -2648,8 +2173,6 @@
             <w:r>
               <w:rPr>
                 <w:rFonts w:ascii="Times New Roman" w:eastAsia="Times New Roman" w:hAnsi="Times New Roman" w:cs="Times New Roman"/>
-                <w:sz w:val="24"/>
-                <w:szCs w:val="24"/>
               </w:rPr>
               <w:t xml:space="preserve"> </w:t>
             </w:r>
@@ -2657,8 +2180,6 @@
             <w:r>
               <w:rPr>
                 <w:rFonts w:ascii="Times New Roman" w:eastAsia="Times New Roman" w:hAnsi="Times New Roman" w:cs="Times New Roman"/>
-                <w:sz w:val="24"/>
-                <w:szCs w:val="24"/>
               </w:rPr>
               <w:t>remotos</w:t>
             </w:r>
@@ -2666,8 +2187,6 @@
             <w:r>
               <w:rPr>
                 <w:rFonts w:ascii="Times New Roman" w:eastAsia="Times New Roman" w:hAnsi="Times New Roman" w:cs="Times New Roman"/>
-                <w:sz w:val="24"/>
-                <w:szCs w:val="24"/>
               </w:rPr>
               <w:t xml:space="preserve"> </w:t>
             </w:r>
@@ -2675,8 +2194,6 @@
             <w:r>
               <w:rPr>
                 <w:rFonts w:ascii="Times New Roman" w:eastAsia="Times New Roman" w:hAnsi="Times New Roman" w:cs="Times New Roman"/>
-                <w:sz w:val="24"/>
-                <w:szCs w:val="24"/>
               </w:rPr>
               <w:t>configurados</w:t>
             </w:r>
@@ -2686,26 +2203,21 @@
         <w:tc>
           <w:tcPr>
             <w:tcW w:w="0" w:type="auto"/>
-            <w:vAlign w:val="center"/>
-            <w:hideMark/>
-          </w:tcPr>
-          <w:p>
-            <w:pPr>
-              <w:spacing w:after="0" w:line="240" w:lineRule="auto"/>
-              <w:rPr>
-                <w:rFonts w:ascii="Times New Roman" w:eastAsia="Times New Roman" w:hAnsi="Times New Roman" w:cs="Times New Roman"/>
-                <w:sz w:val="24"/>
-                <w:szCs w:val="24"/>
-              </w:rPr>
-            </w:pPr>
-            <w:r>
-              <w:rPr>
-                <w:rFonts w:ascii="Courier New" w:eastAsia="Times New Roman" w:hAnsi="Courier New" w:cs="Courier New"/>
-                <w:sz w:val="20"/>
-                <w:szCs w:val="20"/>
+            <w:hideMark/>
+          </w:tcPr>
+          <w:p>
+            <w:pPr>
+              <w:cnfStyle w:val="000000100000" w:firstRow="0" w:lastRow="0" w:firstColumn="0" w:lastColumn="0" w:oddVBand="0" w:evenVBand="0" w:oddHBand="1" w:evenHBand="0" w:firstRowFirstColumn="0" w:firstRowLastColumn="0" w:lastRowFirstColumn="0" w:lastRowLastColumn="0"/>
+              <w:rPr>
+                <w:rFonts w:ascii="Times New Roman" w:eastAsia="Times New Roman" w:hAnsi="Times New Roman" w:cs="Times New Roman"/>
+              </w:rPr>
+            </w:pPr>
+            <w:r>
+              <w:rPr>
+                <w:rFonts w:ascii="Times New Roman" w:eastAsia="Times New Roman" w:hAnsi="Times New Roman" w:cs="Times New Roman"/>
               </w:rPr>
               <w:drawing>
-                <wp:inline distT="0" distB="0" distL="0" distR="0" wp14:anchorId="41F0A957" wp14:editId="5AAEC876">
+                <wp:inline distT="0" distB="0" distL="0" distR="0" wp14:anchorId="4289732B" wp14:editId="2E141443">
                   <wp:extent cx="4228425" cy="2083435"/>
                   <wp:effectExtent l="0" t="0" r="1270" b="0"/>
                   <wp:docPr id="8" name="Imagen 8"/>
@@ -2746,64 +2258,50 @@
       <w:tr>
         <w:trPr>
           <w:trHeight w:val="2320"/>
-          <w:tblCellSpacing w:w="15" w:type="dxa"/>
         </w:trPr>
         <w:tc>
           <w:tcPr>
-            <w:tcW w:w="0" w:type="auto"/>
-            <w:vAlign w:val="center"/>
-            <w:hideMark/>
-          </w:tcPr>
-          <w:p>
-            <w:pPr>
-              <w:spacing w:after="0" w:line="240" w:lineRule="auto"/>
-              <w:rPr>
-                <w:rFonts w:ascii="Times New Roman" w:eastAsia="Times New Roman" w:hAnsi="Times New Roman" w:cs="Times New Roman"/>
-                <w:sz w:val="24"/>
-                <w:szCs w:val="24"/>
-              </w:rPr>
-            </w:pPr>
-            <w:proofErr w:type="spellStart"/>
-            <w:r>
-              <w:rPr>
-                <w:rFonts w:ascii="Courier New" w:eastAsia="Times New Roman" w:hAnsi="Courier New" w:cs="Courier New"/>
-                <w:sz w:val="20"/>
-                <w:szCs w:val="20"/>
+            <w:cnfStyle w:val="001000000000" w:firstRow="0" w:lastRow="0" w:firstColumn="1" w:lastColumn="0" w:oddVBand="0" w:evenVBand="0" w:oddHBand="0" w:evenHBand="0" w:firstRowFirstColumn="0" w:firstRowLastColumn="0" w:lastRowFirstColumn="0" w:lastRowLastColumn="0"/>
+            <w:tcW w:w="0" w:type="auto"/>
+            <w:hideMark/>
+          </w:tcPr>
+          <w:p>
+            <w:pPr>
+              <w:rPr>
+                <w:rFonts w:ascii="Times New Roman" w:eastAsia="Times New Roman" w:hAnsi="Times New Roman" w:cs="Times New Roman"/>
+              </w:rPr>
+            </w:pPr>
+            <w:proofErr w:type="spellStart"/>
+            <w:r>
+              <w:rPr>
+                <w:rFonts w:ascii="Times New Roman" w:eastAsia="Times New Roman" w:hAnsi="Times New Roman" w:cs="Times New Roman"/>
               </w:rPr>
               <w:t>git</w:t>
             </w:r>
             <w:proofErr w:type="spellEnd"/>
             <w:r>
               <w:rPr>
-                <w:rFonts w:ascii="Courier New" w:eastAsia="Times New Roman" w:hAnsi="Courier New" w:cs="Courier New"/>
-                <w:sz w:val="20"/>
-                <w:szCs w:val="20"/>
+                <w:rFonts w:ascii="Times New Roman" w:eastAsia="Times New Roman" w:hAnsi="Times New Roman" w:cs="Times New Roman"/>
               </w:rPr>
               <w:t xml:space="preserve"> push</w:t>
             </w:r>
             <w:r>
               <w:rPr>
                 <w:rFonts w:ascii="Times New Roman" w:eastAsia="Times New Roman" w:hAnsi="Times New Roman" w:cs="Times New Roman"/>
-                <w:sz w:val="24"/>
-                <w:szCs w:val="24"/>
               </w:rPr>
               <w:t xml:space="preserve"> / </w:t>
             </w:r>
             <w:proofErr w:type="spellStart"/>
             <w:r>
               <w:rPr>
-                <w:rFonts w:ascii="Courier New" w:eastAsia="Times New Roman" w:hAnsi="Courier New" w:cs="Courier New"/>
-                <w:sz w:val="20"/>
-                <w:szCs w:val="20"/>
+                <w:rFonts w:ascii="Times New Roman" w:eastAsia="Times New Roman" w:hAnsi="Times New Roman" w:cs="Times New Roman"/>
               </w:rPr>
               <w:t>git</w:t>
             </w:r>
             <w:proofErr w:type="spellEnd"/>
             <w:r>
               <w:rPr>
-                <w:rFonts w:ascii="Courier New" w:eastAsia="Times New Roman" w:hAnsi="Courier New" w:cs="Courier New"/>
-                <w:sz w:val="20"/>
-                <w:szCs w:val="20"/>
+                <w:rFonts w:ascii="Times New Roman" w:eastAsia="Times New Roman" w:hAnsi="Times New Roman" w:cs="Times New Roman"/>
               </w:rPr>
               <w:t xml:space="preserve"> pull</w:t>
             </w:r>
@@ -2812,24 +2310,19 @@
         <w:tc>
           <w:tcPr>
             <w:tcW w:w="0" w:type="auto"/>
-            <w:vAlign w:val="center"/>
-            <w:hideMark/>
-          </w:tcPr>
-          <w:p>
-            <w:pPr>
-              <w:spacing w:after="0" w:line="240" w:lineRule="auto"/>
-              <w:rPr>
-                <w:rFonts w:ascii="Times New Roman" w:eastAsia="Times New Roman" w:hAnsi="Times New Roman" w:cs="Times New Roman"/>
-                <w:sz w:val="24"/>
-                <w:szCs w:val="24"/>
-              </w:rPr>
-            </w:pPr>
-            <w:proofErr w:type="spellStart"/>
-            <w:r>
-              <w:rPr>
-                <w:rFonts w:ascii="Times New Roman" w:eastAsia="Times New Roman" w:hAnsi="Times New Roman" w:cs="Times New Roman"/>
-                <w:sz w:val="24"/>
-                <w:szCs w:val="24"/>
+            <w:hideMark/>
+          </w:tcPr>
+          <w:p>
+            <w:pPr>
+              <w:cnfStyle w:val="000000000000" w:firstRow="0" w:lastRow="0" w:firstColumn="0" w:lastColumn="0" w:oddVBand="0" w:evenVBand="0" w:oddHBand="0" w:evenHBand="0" w:firstRowFirstColumn="0" w:firstRowLastColumn="0" w:lastRowFirstColumn="0" w:lastRowLastColumn="0"/>
+              <w:rPr>
+                <w:rFonts w:ascii="Times New Roman" w:eastAsia="Times New Roman" w:hAnsi="Times New Roman" w:cs="Times New Roman"/>
+              </w:rPr>
+            </w:pPr>
+            <w:proofErr w:type="spellStart"/>
+            <w:r>
+              <w:rPr>
+                <w:rFonts w:ascii="Times New Roman" w:eastAsia="Times New Roman" w:hAnsi="Times New Roman" w:cs="Times New Roman"/>
               </w:rPr>
               <w:t>Enviar</w:t>
             </w:r>
@@ -2837,8 +2330,6 @@
             <w:r>
               <w:rPr>
                 <w:rFonts w:ascii="Times New Roman" w:eastAsia="Times New Roman" w:hAnsi="Times New Roman" w:cs="Times New Roman"/>
-                <w:sz w:val="24"/>
-                <w:szCs w:val="24"/>
               </w:rPr>
               <w:t xml:space="preserve"> o </w:t>
             </w:r>
@@ -2846,8 +2337,6 @@
             <w:r>
               <w:rPr>
                 <w:rFonts w:ascii="Times New Roman" w:eastAsia="Times New Roman" w:hAnsi="Times New Roman" w:cs="Times New Roman"/>
-                <w:sz w:val="24"/>
-                <w:szCs w:val="24"/>
               </w:rPr>
               <w:t>traer</w:t>
             </w:r>
@@ -2855,8 +2344,6 @@
             <w:r>
               <w:rPr>
                 <w:rFonts w:ascii="Times New Roman" w:eastAsia="Times New Roman" w:hAnsi="Times New Roman" w:cs="Times New Roman"/>
-                <w:sz w:val="24"/>
-                <w:szCs w:val="24"/>
               </w:rPr>
               <w:t xml:space="preserve"> </w:t>
             </w:r>
@@ -2864,8 +2351,6 @@
             <w:r>
               <w:rPr>
                 <w:rFonts w:ascii="Times New Roman" w:eastAsia="Times New Roman" w:hAnsi="Times New Roman" w:cs="Times New Roman"/>
-                <w:sz w:val="24"/>
-                <w:szCs w:val="24"/>
               </w:rPr>
               <w:t>cambios</w:t>
             </w:r>
@@ -2875,26 +2360,21 @@
         <w:tc>
           <w:tcPr>
             <w:tcW w:w="0" w:type="auto"/>
-            <w:vAlign w:val="center"/>
-            <w:hideMark/>
-          </w:tcPr>
-          <w:p>
-            <w:pPr>
-              <w:spacing w:after="0" w:line="240" w:lineRule="auto"/>
-              <w:rPr>
-                <w:rFonts w:ascii="Times New Roman" w:eastAsia="Times New Roman" w:hAnsi="Times New Roman" w:cs="Times New Roman"/>
-                <w:sz w:val="24"/>
-                <w:szCs w:val="24"/>
-              </w:rPr>
-            </w:pPr>
-            <w:r>
-              <w:rPr>
-                <w:rFonts w:ascii="Courier New" w:eastAsia="Times New Roman" w:hAnsi="Courier New" w:cs="Courier New"/>
-                <w:sz w:val="20"/>
-                <w:szCs w:val="20"/>
+            <w:hideMark/>
+          </w:tcPr>
+          <w:p>
+            <w:pPr>
+              <w:cnfStyle w:val="000000000000" w:firstRow="0" w:lastRow="0" w:firstColumn="0" w:lastColumn="0" w:oddVBand="0" w:evenVBand="0" w:oddHBand="0" w:evenHBand="0" w:firstRowFirstColumn="0" w:firstRowLastColumn="0" w:lastRowFirstColumn="0" w:lastRowLastColumn="0"/>
+              <w:rPr>
+                <w:rFonts w:ascii="Times New Roman" w:eastAsia="Times New Roman" w:hAnsi="Times New Roman" w:cs="Times New Roman"/>
+              </w:rPr>
+            </w:pPr>
+            <w:r>
+              <w:rPr>
+                <w:rFonts w:ascii="Times New Roman" w:eastAsia="Times New Roman" w:hAnsi="Times New Roman" w:cs="Times New Roman"/>
               </w:rPr>
               <w:drawing>
-                <wp:inline distT="0" distB="0" distL="0" distR="0" wp14:anchorId="4C4B0512" wp14:editId="4399DE7B">
+                <wp:inline distT="0" distB="0" distL="0" distR="0" wp14:anchorId="535A076F" wp14:editId="3FDC16E6">
                   <wp:extent cx="4192771" cy="1524000"/>
                   <wp:effectExtent l="0" t="0" r="0" b="0"/>
                   <wp:docPr id="7" name="Imagen 7"/>
@@ -2934,39 +2414,32 @@
       </w:tr>
       <w:tr>
         <w:trPr>
+          <w:cnfStyle w:val="000000100000" w:firstRow="0" w:lastRow="0" w:firstColumn="0" w:lastColumn="0" w:oddVBand="0" w:evenVBand="0" w:oddHBand="1" w:evenHBand="0" w:firstRowFirstColumn="0" w:firstRowLastColumn="0" w:lastRowFirstColumn="0" w:lastRowLastColumn="0"/>
           <w:trHeight w:val="804"/>
-          <w:tblCellSpacing w:w="15" w:type="dxa"/>
         </w:trPr>
         <w:tc>
           <w:tcPr>
-            <w:tcW w:w="0" w:type="auto"/>
-            <w:vAlign w:val="center"/>
-            <w:hideMark/>
-          </w:tcPr>
-          <w:p>
-            <w:pPr>
-              <w:spacing w:after="0" w:line="240" w:lineRule="auto"/>
-              <w:rPr>
-                <w:rFonts w:ascii="Times New Roman" w:eastAsia="Times New Roman" w:hAnsi="Times New Roman" w:cs="Times New Roman"/>
-                <w:sz w:val="24"/>
-                <w:szCs w:val="24"/>
-              </w:rPr>
-            </w:pPr>
-            <w:proofErr w:type="spellStart"/>
-            <w:r>
-              <w:rPr>
-                <w:rFonts w:ascii="Courier New" w:eastAsia="Times New Roman" w:hAnsi="Courier New" w:cs="Courier New"/>
-                <w:sz w:val="20"/>
-                <w:szCs w:val="20"/>
+            <w:cnfStyle w:val="001000000000" w:firstRow="0" w:lastRow="0" w:firstColumn="1" w:lastColumn="0" w:oddVBand="0" w:evenVBand="0" w:oddHBand="0" w:evenHBand="0" w:firstRowFirstColumn="0" w:firstRowLastColumn="0" w:lastRowFirstColumn="0" w:lastRowLastColumn="0"/>
+            <w:tcW w:w="0" w:type="auto"/>
+            <w:hideMark/>
+          </w:tcPr>
+          <w:p>
+            <w:pPr>
+              <w:rPr>
+                <w:rFonts w:ascii="Times New Roman" w:eastAsia="Times New Roman" w:hAnsi="Times New Roman" w:cs="Times New Roman"/>
+              </w:rPr>
+            </w:pPr>
+            <w:proofErr w:type="spellStart"/>
+            <w:r>
+              <w:rPr>
+                <w:rFonts w:ascii="Times New Roman" w:eastAsia="Times New Roman" w:hAnsi="Times New Roman" w:cs="Times New Roman"/>
               </w:rPr>
               <w:t>git</w:t>
             </w:r>
             <w:proofErr w:type="spellEnd"/>
             <w:r>
               <w:rPr>
-                <w:rFonts w:ascii="Courier New" w:eastAsia="Times New Roman" w:hAnsi="Courier New" w:cs="Courier New"/>
-                <w:sz w:val="20"/>
-                <w:szCs w:val="20"/>
+                <w:rFonts w:ascii="Times New Roman" w:eastAsia="Times New Roman" w:hAnsi="Times New Roman" w:cs="Times New Roman"/>
               </w:rPr>
               <w:t xml:space="preserve"> tag</w:t>
             </w:r>
@@ -2975,24 +2448,19 @@
         <w:tc>
           <w:tcPr>
             <w:tcW w:w="0" w:type="auto"/>
-            <w:vAlign w:val="center"/>
-            <w:hideMark/>
-          </w:tcPr>
-          <w:p>
-            <w:pPr>
-              <w:spacing w:after="0" w:line="240" w:lineRule="auto"/>
-              <w:rPr>
-                <w:rFonts w:ascii="Times New Roman" w:eastAsia="Times New Roman" w:hAnsi="Times New Roman" w:cs="Times New Roman"/>
-                <w:sz w:val="24"/>
-                <w:szCs w:val="24"/>
-              </w:rPr>
-            </w:pPr>
-            <w:proofErr w:type="spellStart"/>
-            <w:r>
-              <w:rPr>
-                <w:rFonts w:ascii="Times New Roman" w:eastAsia="Times New Roman" w:hAnsi="Times New Roman" w:cs="Times New Roman"/>
-                <w:sz w:val="24"/>
-                <w:szCs w:val="24"/>
+            <w:hideMark/>
+          </w:tcPr>
+          <w:p>
+            <w:pPr>
+              <w:cnfStyle w:val="000000100000" w:firstRow="0" w:lastRow="0" w:firstColumn="0" w:lastColumn="0" w:oddVBand="0" w:evenVBand="0" w:oddHBand="1" w:evenHBand="0" w:firstRowFirstColumn="0" w:firstRowLastColumn="0" w:lastRowFirstColumn="0" w:lastRowLastColumn="0"/>
+              <w:rPr>
+                <w:rFonts w:ascii="Times New Roman" w:eastAsia="Times New Roman" w:hAnsi="Times New Roman" w:cs="Times New Roman"/>
+              </w:rPr>
+            </w:pPr>
+            <w:proofErr w:type="spellStart"/>
+            <w:r>
+              <w:rPr>
+                <w:rFonts w:ascii="Times New Roman" w:eastAsia="Times New Roman" w:hAnsi="Times New Roman" w:cs="Times New Roman"/>
               </w:rPr>
               <w:t>Etiquetar</w:t>
             </w:r>
@@ -3000,8 +2468,6 @@
             <w:r>
               <w:rPr>
                 <w:rFonts w:ascii="Times New Roman" w:eastAsia="Times New Roman" w:hAnsi="Times New Roman" w:cs="Times New Roman"/>
-                <w:sz w:val="24"/>
-                <w:szCs w:val="24"/>
               </w:rPr>
               <w:t xml:space="preserve"> </w:t>
             </w:r>
@@ -3009,8 +2475,6 @@
             <w:r>
               <w:rPr>
                 <w:rFonts w:ascii="Times New Roman" w:eastAsia="Times New Roman" w:hAnsi="Times New Roman" w:cs="Times New Roman"/>
-                <w:sz w:val="24"/>
-                <w:szCs w:val="24"/>
               </w:rPr>
               <w:t>una</w:t>
             </w:r>
@@ -3018,8 +2482,6 @@
             <w:r>
               <w:rPr>
                 <w:rFonts w:ascii="Times New Roman" w:eastAsia="Times New Roman" w:hAnsi="Times New Roman" w:cs="Times New Roman"/>
-                <w:sz w:val="24"/>
-                <w:szCs w:val="24"/>
               </w:rPr>
               <w:t xml:space="preserve"> </w:t>
             </w:r>
@@ -3027,8 +2489,6 @@
             <w:r>
               <w:rPr>
                 <w:rFonts w:ascii="Times New Roman" w:eastAsia="Times New Roman" w:hAnsi="Times New Roman" w:cs="Times New Roman"/>
-                <w:sz w:val="24"/>
-                <w:szCs w:val="24"/>
               </w:rPr>
               <w:t>versión</w:t>
             </w:r>
@@ -3038,33 +2498,26 @@
         <w:tc>
           <w:tcPr>
             <w:tcW w:w="0" w:type="auto"/>
-            <w:vAlign w:val="center"/>
-            <w:hideMark/>
-          </w:tcPr>
-          <w:p>
-            <w:pPr>
-              <w:spacing w:after="0" w:line="240" w:lineRule="auto"/>
-              <w:rPr>
-                <w:rFonts w:ascii="Times New Roman" w:eastAsia="Times New Roman" w:hAnsi="Times New Roman" w:cs="Times New Roman"/>
-                <w:sz w:val="24"/>
-                <w:szCs w:val="24"/>
-              </w:rPr>
-            </w:pPr>
-            <w:proofErr w:type="spellStart"/>
-            <w:r>
-              <w:rPr>
-                <w:rFonts w:ascii="Courier New" w:eastAsia="Times New Roman" w:hAnsi="Courier New" w:cs="Courier New"/>
-                <w:sz w:val="20"/>
-                <w:szCs w:val="20"/>
+            <w:hideMark/>
+          </w:tcPr>
+          <w:p>
+            <w:pPr>
+              <w:cnfStyle w:val="000000100000" w:firstRow="0" w:lastRow="0" w:firstColumn="0" w:lastColumn="0" w:oddVBand="0" w:evenVBand="0" w:oddHBand="1" w:evenHBand="0" w:firstRowFirstColumn="0" w:firstRowLastColumn="0" w:lastRowFirstColumn="0" w:lastRowLastColumn="0"/>
+              <w:rPr>
+                <w:rFonts w:ascii="Times New Roman" w:eastAsia="Times New Roman" w:hAnsi="Times New Roman" w:cs="Times New Roman"/>
+              </w:rPr>
+            </w:pPr>
+            <w:proofErr w:type="spellStart"/>
+            <w:r>
+              <w:rPr>
+                <w:rFonts w:ascii="Times New Roman" w:eastAsia="Times New Roman" w:hAnsi="Times New Roman" w:cs="Times New Roman"/>
               </w:rPr>
               <w:t>git</w:t>
             </w:r>
             <w:proofErr w:type="spellEnd"/>
             <w:r>
               <w:rPr>
-                <w:rFonts w:ascii="Courier New" w:eastAsia="Times New Roman" w:hAnsi="Courier New" w:cs="Courier New"/>
-                <w:sz w:val="20"/>
-                <w:szCs w:val="20"/>
+                <w:rFonts w:ascii="Times New Roman" w:eastAsia="Times New Roman" w:hAnsi="Times New Roman" w:cs="Times New Roman"/>
               </w:rPr>
               <w:t xml:space="preserve"> tag v1.0</w:t>
             </w:r>
@@ -3075,9 +2528,561 @@
     <w:p>
       <w:pPr>
         <w:rPr>
+          <w:rFonts w:ascii="Times New Roman" w:hAnsi="Times New Roman" w:cs="Times New Roman"/>
           <w:lang w:val="es-ES"/>
         </w:rPr>
       </w:pPr>
+    </w:p>
+    <w:p>
+      <w:pPr>
+        <w:rPr>
+          <w:rFonts w:ascii="Times New Roman" w:hAnsi="Times New Roman" w:cs="Times New Roman"/>
+          <w:lang w:val="es-ES"/>
+        </w:rPr>
+      </w:pPr>
+      <w:r>
+        <w:rPr>
+          <w:rFonts w:ascii="Times New Roman" w:hAnsi="Times New Roman" w:cs="Times New Roman"/>
+          <w:lang w:val="es-ES"/>
+        </w:rPr>
+        <w:br w:type="page"/>
+      </w:r>
+    </w:p>
+    <w:p>
+      <w:pPr>
+        <w:rPr>
+          <w:rFonts w:ascii="Times New Roman" w:hAnsi="Times New Roman" w:cs="Times New Roman"/>
+          <w:lang w:val="es-ES"/>
+        </w:rPr>
+      </w:pPr>
+    </w:p>
+    <w:p>
+      <w:pPr>
+        <w:pStyle w:val="Ttulo3"/>
+        <w:jc w:val="center"/>
+        <w:rPr>
+          <w:sz w:val="22"/>
+          <w:szCs w:val="22"/>
+          <w:lang w:val="es-ES"/>
+        </w:rPr>
+      </w:pPr>
+      <w:r>
+        <w:rPr>
+          <w:sz w:val="22"/>
+          <w:szCs w:val="22"/>
+          <w:lang w:val="es-ES"/>
+        </w:rPr>
+        <w:t>Conclusión</w:t>
+      </w:r>
+    </w:p>
+    <w:p>
+      <w:pPr>
+        <w:pStyle w:val="NormalWeb"/>
+        <w:rPr>
+          <w:sz w:val="22"/>
+          <w:szCs w:val="22"/>
+          <w:lang w:val="es-ES"/>
+        </w:rPr>
+      </w:pPr>
+      <w:r>
+        <w:rPr>
+          <w:sz w:val="22"/>
+          <w:szCs w:val="22"/>
+          <w:lang w:val="es-ES"/>
+        </w:rPr>
+        <w:t xml:space="preserve">Los fundamentos de </w:t>
+      </w:r>
+      <w:proofErr w:type="spellStart"/>
+      <w:r>
+        <w:rPr>
+          <w:sz w:val="22"/>
+          <w:szCs w:val="22"/>
+          <w:lang w:val="es-ES"/>
+        </w:rPr>
+        <w:t>Git</w:t>
+      </w:r>
+      <w:proofErr w:type="spellEnd"/>
+      <w:r>
+        <w:rPr>
+          <w:sz w:val="22"/>
+          <w:szCs w:val="22"/>
+          <w:lang w:val="es-ES"/>
+        </w:rPr>
+        <w:t xml:space="preserve"> giran en torno a un ciclo de trabajo sencillo: los archivos pasan de </w:t>
+      </w:r>
+      <w:r>
+        <w:rPr>
+          <w:rStyle w:val="nfasis"/>
+          <w:sz w:val="22"/>
+          <w:szCs w:val="22"/>
+          <w:lang w:val="es-ES"/>
+        </w:rPr>
+        <w:t>sin seguimiento</w:t>
+      </w:r>
+      <w:r>
+        <w:rPr>
+          <w:sz w:val="22"/>
+          <w:szCs w:val="22"/>
+          <w:lang w:val="es-ES"/>
+        </w:rPr>
+        <w:t xml:space="preserve"> a </w:t>
+      </w:r>
+      <w:r>
+        <w:rPr>
+          <w:rStyle w:val="nfasis"/>
+          <w:sz w:val="22"/>
+          <w:szCs w:val="22"/>
+          <w:lang w:val="es-ES"/>
+        </w:rPr>
+        <w:t>preparados</w:t>
+      </w:r>
+      <w:r>
+        <w:rPr>
+          <w:sz w:val="22"/>
+          <w:szCs w:val="22"/>
+          <w:lang w:val="es-ES"/>
+        </w:rPr>
+        <w:t xml:space="preserve"> con </w:t>
+      </w:r>
+      <w:proofErr w:type="spellStart"/>
+      <w:r>
+        <w:rPr>
+          <w:rStyle w:val="CdigoHTML"/>
+          <w:rFonts w:ascii="Times New Roman" w:hAnsi="Times New Roman" w:cs="Times New Roman"/>
+          <w:sz w:val="22"/>
+          <w:szCs w:val="22"/>
+          <w:lang w:val="es-ES"/>
+        </w:rPr>
+        <w:t>git</w:t>
+      </w:r>
+      <w:proofErr w:type="spellEnd"/>
+      <w:r>
+        <w:rPr>
+          <w:rStyle w:val="CdigoHTML"/>
+          <w:rFonts w:ascii="Times New Roman" w:hAnsi="Times New Roman" w:cs="Times New Roman"/>
+          <w:sz w:val="22"/>
+          <w:szCs w:val="22"/>
+          <w:lang w:val="es-ES"/>
+        </w:rPr>
+        <w:t xml:space="preserve"> </w:t>
+      </w:r>
+      <w:proofErr w:type="spellStart"/>
+      <w:r>
+        <w:rPr>
+          <w:rStyle w:val="CdigoHTML"/>
+          <w:rFonts w:ascii="Times New Roman" w:hAnsi="Times New Roman" w:cs="Times New Roman"/>
+          <w:sz w:val="22"/>
+          <w:szCs w:val="22"/>
+          <w:lang w:val="es-ES"/>
+        </w:rPr>
+        <w:t>add</w:t>
+      </w:r>
+      <w:proofErr w:type="spellEnd"/>
+      <w:r>
+        <w:rPr>
+          <w:sz w:val="22"/>
+          <w:szCs w:val="22"/>
+          <w:lang w:val="es-ES"/>
+        </w:rPr>
+        <w:t xml:space="preserve">, y de ahí a </w:t>
+      </w:r>
+      <w:r>
+        <w:rPr>
+          <w:rStyle w:val="nfasis"/>
+          <w:sz w:val="22"/>
+          <w:szCs w:val="22"/>
+          <w:lang w:val="es-ES"/>
+        </w:rPr>
+        <w:t>confirmados</w:t>
+      </w:r>
+      <w:r>
+        <w:rPr>
+          <w:sz w:val="22"/>
+          <w:szCs w:val="22"/>
+          <w:lang w:val="es-ES"/>
+        </w:rPr>
+        <w:t xml:space="preserve"> con </w:t>
+      </w:r>
+      <w:proofErr w:type="spellStart"/>
+      <w:r>
+        <w:rPr>
+          <w:rStyle w:val="CdigoHTML"/>
+          <w:rFonts w:ascii="Times New Roman" w:hAnsi="Times New Roman" w:cs="Times New Roman"/>
+          <w:sz w:val="22"/>
+          <w:szCs w:val="22"/>
+          <w:lang w:val="es-ES"/>
+        </w:rPr>
+        <w:t>git</w:t>
+      </w:r>
+      <w:proofErr w:type="spellEnd"/>
+      <w:r>
+        <w:rPr>
+          <w:rStyle w:val="CdigoHTML"/>
+          <w:rFonts w:ascii="Times New Roman" w:hAnsi="Times New Roman" w:cs="Times New Roman"/>
+          <w:sz w:val="22"/>
+          <w:szCs w:val="22"/>
+          <w:lang w:val="es-ES"/>
+        </w:rPr>
+        <w:t xml:space="preserve"> </w:t>
+      </w:r>
+      <w:proofErr w:type="spellStart"/>
+      <w:r>
+        <w:rPr>
+          <w:rStyle w:val="CdigoHTML"/>
+          <w:rFonts w:ascii="Times New Roman" w:hAnsi="Times New Roman" w:cs="Times New Roman"/>
+          <w:sz w:val="22"/>
+          <w:szCs w:val="22"/>
+          <w:lang w:val="es-ES"/>
+        </w:rPr>
+        <w:t>commit</w:t>
+      </w:r>
+      <w:proofErr w:type="spellEnd"/>
+      <w:r>
+        <w:rPr>
+          <w:sz w:val="22"/>
+          <w:szCs w:val="22"/>
+          <w:lang w:val="es-ES"/>
+        </w:rPr>
+        <w:t xml:space="preserve">, quedando registrados en el historial. El área de preparación permite decidir qué cambios entran en cada </w:t>
+      </w:r>
+      <w:proofErr w:type="spellStart"/>
+      <w:r>
+        <w:rPr>
+          <w:sz w:val="22"/>
+          <w:szCs w:val="22"/>
+          <w:lang w:val="es-ES"/>
+        </w:rPr>
+        <w:t>commit</w:t>
+      </w:r>
+      <w:proofErr w:type="spellEnd"/>
+      <w:r>
+        <w:rPr>
+          <w:sz w:val="22"/>
+          <w:szCs w:val="22"/>
+          <w:lang w:val="es-ES"/>
+        </w:rPr>
+        <w:t xml:space="preserve">, y comandos como </w:t>
+      </w:r>
+      <w:proofErr w:type="spellStart"/>
+      <w:r>
+        <w:rPr>
+          <w:rStyle w:val="CdigoHTML"/>
+          <w:rFonts w:ascii="Times New Roman" w:hAnsi="Times New Roman" w:cs="Times New Roman"/>
+          <w:sz w:val="22"/>
+          <w:szCs w:val="22"/>
+          <w:lang w:val="es-ES"/>
+        </w:rPr>
+        <w:t>git</w:t>
+      </w:r>
+      <w:proofErr w:type="spellEnd"/>
+      <w:r>
+        <w:rPr>
+          <w:rStyle w:val="CdigoHTML"/>
+          <w:rFonts w:ascii="Times New Roman" w:hAnsi="Times New Roman" w:cs="Times New Roman"/>
+          <w:sz w:val="22"/>
+          <w:szCs w:val="22"/>
+          <w:lang w:val="es-ES"/>
+        </w:rPr>
+        <w:t xml:space="preserve"> status</w:t>
+      </w:r>
+      <w:r>
+        <w:rPr>
+          <w:sz w:val="22"/>
+          <w:szCs w:val="22"/>
+          <w:lang w:val="es-ES"/>
+        </w:rPr>
+        <w:t xml:space="preserve">, </w:t>
+      </w:r>
+      <w:proofErr w:type="spellStart"/>
+      <w:r>
+        <w:rPr>
+          <w:rStyle w:val="CdigoHTML"/>
+          <w:rFonts w:ascii="Times New Roman" w:hAnsi="Times New Roman" w:cs="Times New Roman"/>
+          <w:sz w:val="22"/>
+          <w:szCs w:val="22"/>
+          <w:lang w:val="es-ES"/>
+        </w:rPr>
+        <w:t>git</w:t>
+      </w:r>
+      <w:proofErr w:type="spellEnd"/>
+      <w:r>
+        <w:rPr>
+          <w:rStyle w:val="CdigoHTML"/>
+          <w:rFonts w:ascii="Times New Roman" w:hAnsi="Times New Roman" w:cs="Times New Roman"/>
+          <w:sz w:val="22"/>
+          <w:szCs w:val="22"/>
+          <w:lang w:val="es-ES"/>
+        </w:rPr>
+        <w:t xml:space="preserve"> </w:t>
+      </w:r>
+      <w:proofErr w:type="spellStart"/>
+      <w:r>
+        <w:rPr>
+          <w:rStyle w:val="CdigoHTML"/>
+          <w:rFonts w:ascii="Times New Roman" w:hAnsi="Times New Roman" w:cs="Times New Roman"/>
+          <w:sz w:val="22"/>
+          <w:szCs w:val="22"/>
+          <w:lang w:val="es-ES"/>
+        </w:rPr>
+        <w:t>diff</w:t>
+      </w:r>
+      <w:proofErr w:type="spellEnd"/>
+      <w:r>
+        <w:rPr>
+          <w:sz w:val="22"/>
+          <w:szCs w:val="22"/>
+          <w:lang w:val="es-ES"/>
+        </w:rPr>
+        <w:t xml:space="preserve"> y </w:t>
+      </w:r>
+      <w:proofErr w:type="spellStart"/>
+      <w:r>
+        <w:rPr>
+          <w:rStyle w:val="CdigoHTML"/>
+          <w:rFonts w:ascii="Times New Roman" w:hAnsi="Times New Roman" w:cs="Times New Roman"/>
+          <w:sz w:val="22"/>
+          <w:szCs w:val="22"/>
+          <w:lang w:val="es-ES"/>
+        </w:rPr>
+        <w:t>git</w:t>
+      </w:r>
+      <w:proofErr w:type="spellEnd"/>
+      <w:r>
+        <w:rPr>
+          <w:rStyle w:val="CdigoHTML"/>
+          <w:rFonts w:ascii="Times New Roman" w:hAnsi="Times New Roman" w:cs="Times New Roman"/>
+          <w:sz w:val="22"/>
+          <w:szCs w:val="22"/>
+          <w:lang w:val="es-ES"/>
+        </w:rPr>
+        <w:t xml:space="preserve"> log --</w:t>
+      </w:r>
+      <w:proofErr w:type="spellStart"/>
+      <w:r>
+        <w:rPr>
+          <w:rStyle w:val="CdigoHTML"/>
+          <w:rFonts w:ascii="Times New Roman" w:hAnsi="Times New Roman" w:cs="Times New Roman"/>
+          <w:sz w:val="22"/>
+          <w:szCs w:val="22"/>
+          <w:lang w:val="es-ES"/>
+        </w:rPr>
+        <w:t>oneline</w:t>
+      </w:r>
+      <w:proofErr w:type="spellEnd"/>
+      <w:r>
+        <w:rPr>
+          <w:sz w:val="22"/>
+          <w:szCs w:val="22"/>
+          <w:lang w:val="es-ES"/>
+        </w:rPr>
+        <w:t xml:space="preserve"> ayudan a revisar el estado del proyecto antes y después de cada paso.</w:t>
+      </w:r>
+    </w:p>
+    <w:p>
+      <w:pPr>
+        <w:pStyle w:val="NormalWeb"/>
+        <w:rPr>
+          <w:sz w:val="22"/>
+          <w:szCs w:val="22"/>
+          <w:lang w:val="es-ES"/>
+        </w:rPr>
+      </w:pPr>
+      <w:r>
+        <w:rPr>
+          <w:sz w:val="22"/>
+          <w:szCs w:val="22"/>
+          <w:lang w:val="es-ES"/>
+        </w:rPr>
+        <w:t xml:space="preserve">En la práctica de este capítulo se creó el archivo </w:t>
+      </w:r>
+      <w:r>
+        <w:rPr>
+          <w:rStyle w:val="CdigoHTML"/>
+          <w:rFonts w:ascii="Times New Roman" w:hAnsi="Times New Roman" w:cs="Times New Roman"/>
+          <w:sz w:val="22"/>
+          <w:szCs w:val="22"/>
+          <w:lang w:val="es-ES"/>
+        </w:rPr>
+        <w:t>notas.txt</w:t>
+      </w:r>
+      <w:r>
+        <w:rPr>
+          <w:sz w:val="22"/>
+          <w:szCs w:val="22"/>
+          <w:lang w:val="es-ES"/>
+        </w:rPr>
+        <w:t xml:space="preserve">, se confirmó en dos </w:t>
+      </w:r>
+      <w:proofErr w:type="spellStart"/>
+      <w:r>
+        <w:rPr>
+          <w:sz w:val="22"/>
+          <w:szCs w:val="22"/>
+          <w:lang w:val="es-ES"/>
+        </w:rPr>
+        <w:t>commits</w:t>
+      </w:r>
+      <w:proofErr w:type="spellEnd"/>
+      <w:r>
+        <w:rPr>
+          <w:sz w:val="22"/>
+          <w:szCs w:val="22"/>
+          <w:lang w:val="es-ES"/>
+        </w:rPr>
+        <w:t xml:space="preserve"> con mensajes descriptivos y se verificó el historial. También se comprobó que el repositorio local está conectado a GitHub mediante el remoto </w:t>
+      </w:r>
+      <w:proofErr w:type="spellStart"/>
+      <w:r>
+        <w:rPr>
+          <w:rStyle w:val="CdigoHTML"/>
+          <w:rFonts w:ascii="Times New Roman" w:hAnsi="Times New Roman" w:cs="Times New Roman"/>
+          <w:sz w:val="22"/>
+          <w:szCs w:val="22"/>
+          <w:lang w:val="es-ES"/>
+        </w:rPr>
+        <w:t>origin</w:t>
+      </w:r>
+      <w:proofErr w:type="spellEnd"/>
+      <w:r>
+        <w:rPr>
+          <w:sz w:val="22"/>
+          <w:szCs w:val="22"/>
+          <w:lang w:val="es-ES"/>
+        </w:rPr>
+        <w:t xml:space="preserve">, al que se envían los cambios con </w:t>
+      </w:r>
+      <w:proofErr w:type="spellStart"/>
+      <w:r>
+        <w:rPr>
+          <w:rStyle w:val="CdigoHTML"/>
+          <w:rFonts w:ascii="Times New Roman" w:hAnsi="Times New Roman" w:cs="Times New Roman"/>
+          <w:sz w:val="22"/>
+          <w:szCs w:val="22"/>
+          <w:lang w:val="es-ES"/>
+        </w:rPr>
+        <w:t>git</w:t>
+      </w:r>
+      <w:proofErr w:type="spellEnd"/>
+      <w:r>
+        <w:rPr>
+          <w:rStyle w:val="CdigoHTML"/>
+          <w:rFonts w:ascii="Times New Roman" w:hAnsi="Times New Roman" w:cs="Times New Roman"/>
+          <w:sz w:val="22"/>
+          <w:szCs w:val="22"/>
+          <w:lang w:val="es-ES"/>
+        </w:rPr>
+        <w:t xml:space="preserve"> </w:t>
+      </w:r>
+      <w:proofErr w:type="spellStart"/>
+      <w:r>
+        <w:rPr>
+          <w:rStyle w:val="CdigoHTML"/>
+          <w:rFonts w:ascii="Times New Roman" w:hAnsi="Times New Roman" w:cs="Times New Roman"/>
+          <w:sz w:val="22"/>
+          <w:szCs w:val="22"/>
+          <w:lang w:val="es-ES"/>
+        </w:rPr>
+        <w:t>push</w:t>
+      </w:r>
+      <w:proofErr w:type="spellEnd"/>
+      <w:r>
+        <w:rPr>
+          <w:sz w:val="22"/>
+          <w:szCs w:val="22"/>
+          <w:lang w:val="es-ES"/>
+        </w:rPr>
+        <w:t xml:space="preserve">. Además, el </w:t>
+      </w:r>
+      <w:r>
+        <w:rPr>
+          <w:sz w:val="22"/>
+          <w:szCs w:val="22"/>
+          <w:lang w:val="es-ES"/>
+        </w:rPr>
+        <w:t xml:space="preserve">archivo. </w:t>
+      </w:r>
+      <w:proofErr w:type="spellStart"/>
+      <w:r>
+        <w:rPr>
+          <w:sz w:val="22"/>
+          <w:szCs w:val="22"/>
+          <w:lang w:val="es-ES"/>
+        </w:rPr>
+        <w:t>gitignore</w:t>
+      </w:r>
+      <w:proofErr w:type="spellEnd"/>
+      <w:r>
+        <w:rPr>
+          <w:sz w:val="22"/>
+          <w:szCs w:val="22"/>
+          <w:lang w:val="es-ES"/>
+        </w:rPr>
+        <w:t xml:space="preserve"> permitió excluir archivos temporales de Word, evitando que se suban al repositorio por error.</w:t>
+      </w:r>
+    </w:p>
+    <w:p>
+      <w:pPr>
+        <w:pStyle w:val="NormalWeb"/>
+        <w:rPr>
+          <w:sz w:val="22"/>
+          <w:szCs w:val="22"/>
+          <w:lang w:val="es-ES"/>
+        </w:rPr>
+      </w:pPr>
+      <w:r>
+        <w:rPr>
+          <w:sz w:val="22"/>
+          <w:szCs w:val="22"/>
+          <w:lang w:val="es-ES"/>
+        </w:rPr>
+        <w:t xml:space="preserve">En conclusión, dominar este ciclo (modificar, preparar, confirmar y subir) es la base de todo el trabajo con </w:t>
+      </w:r>
+      <w:proofErr w:type="spellStart"/>
+      <w:r>
+        <w:rPr>
+          <w:sz w:val="22"/>
+          <w:szCs w:val="22"/>
+          <w:lang w:val="es-ES"/>
+        </w:rPr>
+        <w:t>Git</w:t>
+      </w:r>
+      <w:proofErr w:type="spellEnd"/>
+      <w:r>
+        <w:rPr>
+          <w:sz w:val="22"/>
+          <w:szCs w:val="22"/>
+          <w:lang w:val="es-ES"/>
+        </w:rPr>
+        <w:t xml:space="preserve">, porque cada </w:t>
+      </w:r>
+      <w:proofErr w:type="spellStart"/>
+      <w:r>
+        <w:rPr>
+          <w:sz w:val="22"/>
+          <w:szCs w:val="22"/>
+          <w:lang w:val="es-ES"/>
+        </w:rPr>
+        <w:t>commit</w:t>
+      </w:r>
+      <w:proofErr w:type="spellEnd"/>
+      <w:r>
+        <w:rPr>
+          <w:sz w:val="22"/>
+          <w:szCs w:val="22"/>
+          <w:lang w:val="es-ES"/>
+        </w:rPr>
+        <w:t xml:space="preserve"> bien descrito deja un historial claro que facilita revisar, corregir y recuperar versiones anteriores del proyecto.</w:t>
+      </w:r>
+    </w:p>
+    <w:p>
+      <w:pPr>
+        <w:rPr>
+          <w:rFonts w:ascii="Times New Roman" w:hAnsi="Times New Roman" w:cs="Times New Roman"/>
+          <w:lang w:val="es-ES"/>
+        </w:rPr>
+      </w:pPr>
+      <w:bookmarkStart w:id="0" w:name="_GoBack"/>
+      <w:bookmarkEnd w:id="0"/>
     </w:p>
     <w:sectPr>
       <w:pgSz w:w="12240" w:h="15840"/>
@@ -3752,6 +3757,82 @@
       <w:iCs/>
     </w:rPr>
   </w:style>
+  <w:style w:type="table" w:styleId="Tabladecuadrcula4-nfasis1">
+    <w:name w:val="Grid Table 4 Accent 1"/>
+    <w:basedOn w:val="Tablanormal"/>
+    <w:uiPriority w:val="49"/>
+    <w:rsid w:val="00893A95"/>
+    <w:pPr>
+      <w:spacing w:after="0" w:line="240" w:lineRule="auto"/>
+    </w:pPr>
+    <w:tblPr>
+      <w:tblStyleRowBandSize w:val="1"/>
+      <w:tblStyleColBandSize w:val="1"/>
+      <w:tblBorders>
+        <w:top w:val="single" w:sz="4" w:space="0" w:color="9CC2E5" w:themeColor="accent1" w:themeTint="99"/>
+        <w:left w:val="single" w:sz="4" w:space="0" w:color="9CC2E5" w:themeColor="accent1" w:themeTint="99"/>
+        <w:bottom w:val="single" w:sz="4" w:space="0" w:color="9CC2E5" w:themeColor="accent1" w:themeTint="99"/>
+        <w:right w:val="single" w:sz="4" w:space="0" w:color="9CC2E5" w:themeColor="accent1" w:themeTint="99"/>
+        <w:insideH w:val="single" w:sz="4" w:space="0" w:color="9CC2E5" w:themeColor="accent1" w:themeTint="99"/>
+        <w:insideV w:val="single" w:sz="4" w:space="0" w:color="9CC2E5" w:themeColor="accent1" w:themeTint="99"/>
+      </w:tblBorders>
+    </w:tblPr>
+    <w:tblStylePr w:type="firstRow">
+      <w:rPr>
+        <w:b/>
+        <w:bCs/>
+        <w:color w:val="FFFFFF" w:themeColor="background1"/>
+      </w:rPr>
+      <w:tblPr/>
+      <w:tcPr>
+        <w:tcBorders>
+          <w:top w:val="single" w:sz="4" w:space="0" w:color="5B9BD5" w:themeColor="accent1"/>
+          <w:left w:val="single" w:sz="4" w:space="0" w:color="5B9BD5" w:themeColor="accent1"/>
+          <w:bottom w:val="single" w:sz="4" w:space="0" w:color="5B9BD5" w:themeColor="accent1"/>
+          <w:right w:val="single" w:sz="4" w:space="0" w:color="5B9BD5" w:themeColor="accent1"/>
+          <w:insideH w:val="nil"/>
+          <w:insideV w:val="nil"/>
+        </w:tcBorders>
+        <w:shd w:val="clear" w:color="auto" w:fill="5B9BD5" w:themeFill="accent1"/>
+      </w:tcPr>
+    </w:tblStylePr>
+    <w:tblStylePr w:type="lastRow">
+      <w:rPr>
+        <w:b/>
+        <w:bCs/>
+      </w:rPr>
+      <w:tblPr/>
+      <w:tcPr>
+        <w:tcBorders>
+          <w:top w:val="double" w:sz="4" w:space="0" w:color="5B9BD5" w:themeColor="accent1"/>
+        </w:tcBorders>
+      </w:tcPr>
+    </w:tblStylePr>
+    <w:tblStylePr w:type="firstCol">
+      <w:rPr>
+        <w:b/>
+        <w:bCs/>
+      </w:rPr>
+    </w:tblStylePr>
+    <w:tblStylePr w:type="lastCol">
+      <w:rPr>
+        <w:b/>
+        <w:bCs/>
+      </w:rPr>
+    </w:tblStylePr>
+    <w:tblStylePr w:type="band1Vert">
+      <w:tblPr/>
+      <w:tcPr>
+        <w:shd w:val="clear" w:color="auto" w:fill="DEEAF6" w:themeFill="accent1" w:themeFillTint="33"/>
+      </w:tcPr>
+    </w:tblStylePr>
+    <w:tblStylePr w:type="band1Horz">
+      <w:tblPr/>
+      <w:tcPr>
+        <w:shd w:val="clear" w:color="auto" w:fill="DEEAF6" w:themeFill="accent1" w:themeFillTint="33"/>
+      </w:tcPr>
+    </w:tblStylePr>
+  </w:style>
 </w:styles>
 </file>
 

</xml_diff>